<commit_message>
Updated the Mission Statement
</commit_message>
<xml_diff>
--- a/srDesign_MissonStatement.docx
+++ b/srDesign_MissonStatement.docx
@@ -10,22 +10,17 @@
         <w:spacing w:after="0" w:line="240" w:lineRule="auto"/>
         <w:rPr>
           <w:rFonts w:ascii="CMSSBX10" w:hAnsi="CMSSBX10" w:cs="CMSSBX10"/>
-          <w:color w:val="000000"/>
-        </w:rPr>
-      </w:pPr>
-      <w:r>
-        <w:rPr>
-          <w:rFonts w:ascii="CMSSBX10" w:hAnsi="CMSSBX10" w:cs="CMSSBX10"/>
-          <w:color w:val="000000"/>
-        </w:rPr>
-        <w:t xml:space="preserve">Mission Statement for the </w:t>
-      </w:r>
-      <w:r>
-        <w:rPr>
-          <w:rFonts w:ascii="CMSSBX10" w:hAnsi="CMSSBX10" w:cs="CMSSBX10"/>
-          <w:color w:val="000000"/>
-        </w:rPr>
-        <w:t>Set Top Box Multiplayer Framework</w:t>
+          <w:b/>
+          <w:color w:val="000000"/>
+        </w:rPr>
+      </w:pPr>
+      <w:r>
+        <w:rPr>
+          <w:rFonts w:ascii="CMSSBX10" w:hAnsi="CMSSBX10" w:cs="CMSSBX10"/>
+          <w:b/>
+          <w:color w:val="000000"/>
+        </w:rPr>
+        <w:t>Mission Statement for the Set Top Box Multiplayer Framework</w:t>
       </w:r>
     </w:p>
     <w:p>
@@ -42,27 +37,66 @@
       <w:r>
         <w:rPr>
           <w:rFonts w:ascii="CMSSBX10" w:hAnsi="CMSSBX10" w:cs="CMSSBX10"/>
-          <w:color w:val="000000"/>
-        </w:rPr>
-        <w:t xml:space="preserve">Product Description: </w:t>
+          <w:b/>
+          <w:color w:val="000000"/>
+        </w:rPr>
+        <w:t>Product Description:</w:t>
+      </w:r>
+      <w:r>
+        <w:rPr>
+          <w:rFonts w:ascii="CMSSBX10" w:hAnsi="CMSSBX10" w:cs="CMSSBX10"/>
+          <w:color w:val="000000"/>
+        </w:rPr>
+        <w:t xml:space="preserve"> </w:t>
       </w:r>
       <w:r>
         <w:rPr>
           <w:rFonts w:ascii="CMSS10" w:hAnsi="CMSS10" w:cs="CMSS10"/>
           <w:color w:val="000000"/>
         </w:rPr>
-        <w:t xml:space="preserve">A </w:t>
-      </w:r>
-      <w:r>
+        <w:t>A plugin based server for hosting and controlling multiplayer games for STBs</w:t>
+      </w:r>
+    </w:p>
+    <w:p>
+      <w:pPr>
+        <w:autoSpaceDE w:val="0"/>
+        <w:autoSpaceDN w:val="0"/>
+        <w:adjustRightInd w:val="0"/>
+        <w:spacing w:after="0" w:line="240" w:lineRule="auto"/>
         <w:rPr>
           <w:rFonts w:ascii="CMSS10" w:hAnsi="CMSS10" w:cs="CMSS10"/>
           <w:color w:val="000000"/>
         </w:rPr>
-        <w:t>plugin based server for hosting and controlling multiplayer games for STBs</w:t>
-      </w:r>
-    </w:p>
-    <w:p>
-      <w:pPr>
+      </w:pPr>
+    </w:p>
+    <w:p>
+      <w:pPr>
+        <w:autoSpaceDE w:val="0"/>
+        <w:autoSpaceDN w:val="0"/>
+        <w:adjustRightInd w:val="0"/>
+        <w:spacing w:after="0" w:line="240" w:lineRule="auto"/>
+        <w:rPr>
+          <w:rFonts w:ascii="CMSSBX10" w:hAnsi="CMSSBX10" w:cs="CMSSBX10"/>
+          <w:b/>
+          <w:color w:val="000000"/>
+        </w:rPr>
+      </w:pPr>
+      <w:r>
+        <w:rPr>
+          <w:rFonts w:ascii="CMSSBX10" w:hAnsi="CMSSBX10" w:cs="CMSSBX10"/>
+          <w:b/>
+          <w:color w:val="000000"/>
+        </w:rPr>
+        <w:t>Key Business Goals:</w:t>
+      </w:r>
+    </w:p>
+    <w:p>
+      <w:pPr>
+        <w:pStyle w:val="ListParagraph"/>
+        <w:numPr>
+          <w:ilvl w:val="0"/>
+          <w:numId w:val="1"/>
+        </w:numPr>
         <w:autoSpaceDE w:val="0"/>
         <w:autoSpaceDN w:val="0"/>
         <w:adjustRightInd w:val="0"/>
@@ -72,91 +106,292 @@
           <w:color w:val="000000"/>
         </w:rPr>
       </w:pPr>
-      <w:bookmarkStart w:id="0" w:name="_GoBack"/>
-      <w:bookmarkEnd w:id="0"/>
-    </w:p>
-    <w:p>
-      <w:pPr>
-        <w:autoSpaceDE w:val="0"/>
-        <w:autoSpaceDN w:val="0"/>
-        <w:adjustRightInd w:val="0"/>
-        <w:spacing w:after="0" w:line="240" w:lineRule="auto"/>
-        <w:rPr>
-          <w:rFonts w:ascii="CMSSBX10" w:hAnsi="CMSSBX10" w:cs="CMSSBX10"/>
-          <w:color w:val="000000"/>
-        </w:rPr>
-      </w:pPr>
-      <w:r>
-        <w:rPr>
-          <w:rFonts w:ascii="CMSSBX10" w:hAnsi="CMSSBX10" w:cs="CMSSBX10"/>
-          <w:color w:val="000000"/>
-        </w:rPr>
-        <w:t>Key Business Goals:</w:t>
-      </w:r>
-    </w:p>
-    <w:p>
-      <w:pPr>
-        <w:autoSpaceDE w:val="0"/>
-        <w:autoSpaceDN w:val="0"/>
-        <w:adjustRightInd w:val="0"/>
-        <w:spacing w:after="0" w:line="240" w:lineRule="auto"/>
+      <w:r>
         <w:rPr>
           <w:rFonts w:ascii="CMSS10" w:hAnsi="CMSS10" w:cs="CMSS10"/>
           <w:color w:val="000000"/>
         </w:rPr>
-      </w:pPr>
-      <w:r>
+        <w:t>Keep c</w:t>
+      </w:r>
+      <w:r>
+        <w:rPr>
+          <w:rFonts w:ascii="CMSS10" w:hAnsi="CMSS10" w:cs="CMSS10"/>
+          <w:color w:val="000000"/>
+        </w:rPr>
+        <w:t>onsumers</w:t>
+      </w:r>
+      <w:r>
+        <w:rPr>
+          <w:rFonts w:ascii="CMSS10" w:hAnsi="CMSS10" w:cs="CMSS10"/>
+          <w:color w:val="000000"/>
+        </w:rPr>
+        <w:t xml:space="preserve"> interested in IPTV technology</w:t>
+      </w:r>
+    </w:p>
+    <w:p>
+      <w:pPr>
+        <w:autoSpaceDE w:val="0"/>
+        <w:autoSpaceDN w:val="0"/>
+        <w:adjustRightInd w:val="0"/>
+        <w:spacing w:after="0" w:line="240" w:lineRule="auto"/>
         <w:rPr>
           <w:rFonts w:ascii="MSAM10" w:hAnsi="MSAM10" w:cs="MSAM10"/>
           <w:color w:val="333367"/>
           <w:sz w:val="16"/>
           <w:szCs w:val="16"/>
         </w:rPr>
-        <w:t xml:space="preserve">I </w:t>
-      </w:r>
-      <w:r>
+      </w:pPr>
+    </w:p>
+    <w:p>
+      <w:pPr>
+        <w:autoSpaceDE w:val="0"/>
+        <w:autoSpaceDN w:val="0"/>
+        <w:adjustRightInd w:val="0"/>
+        <w:spacing w:after="0" w:line="240" w:lineRule="auto"/>
         <w:rPr>
           <w:rFonts w:ascii="CMSS10" w:hAnsi="CMSS10" w:cs="CMSS10"/>
           <w:color w:val="000000"/>
         </w:rPr>
-        <w:t>Product introduced in the second quarter 2009</w:t>
-      </w:r>
-    </w:p>
-    <w:p>
-      <w:pPr>
-        <w:autoSpaceDE w:val="0"/>
-        <w:autoSpaceDN w:val="0"/>
-        <w:adjustRightInd w:val="0"/>
-        <w:spacing w:after="0" w:line="240" w:lineRule="auto"/>
-        <w:rPr>
-          <w:rFonts w:ascii="MSAM10" w:hAnsi="MSAM10" w:cs="MSAM10"/>
-          <w:color w:val="333367"/>
-          <w:sz w:val="16"/>
-          <w:szCs w:val="16"/>
-        </w:rPr>
-      </w:pPr>
-    </w:p>
-    <w:p>
-      <w:pPr>
-        <w:autoSpaceDE w:val="0"/>
-        <w:autoSpaceDN w:val="0"/>
-        <w:adjustRightInd w:val="0"/>
-        <w:spacing w:after="0" w:line="240" w:lineRule="auto"/>
+      </w:pPr>
+      <w:r>
+        <w:rPr>
+          <w:rFonts w:ascii="CMSSBX10" w:hAnsi="CMSSBX10" w:cs="CMSSBX10"/>
+          <w:b/>
+          <w:color w:val="000000"/>
+        </w:rPr>
+        <w:t>Primary Market:</w:t>
+      </w:r>
+      <w:r>
+        <w:rPr>
+          <w:rFonts w:ascii="CMSSBX10" w:hAnsi="CMSSBX10" w:cs="CMSSBX10"/>
+          <w:color w:val="000000"/>
+        </w:rPr>
+        <w:t xml:space="preserve"> </w:t>
+      </w:r>
+      <w:r>
         <w:rPr>
           <w:rFonts w:ascii="CMSS10" w:hAnsi="CMSS10" w:cs="CMSS10"/>
           <w:color w:val="000000"/>
         </w:rPr>
-      </w:pPr>
-      <w:r>
-        <w:rPr>
-          <w:rFonts w:ascii="CMSSBX10" w:hAnsi="CMSSBX10" w:cs="CMSSBX10"/>
-          <w:color w:val="000000"/>
-        </w:rPr>
-        <w:t xml:space="preserve">Primary Market: </w:t>
-      </w:r>
-      <w:r>
+        <w:t>Consumers</w:t>
+      </w:r>
+    </w:p>
+    <w:p>
+      <w:pPr>
+        <w:autoSpaceDE w:val="0"/>
+        <w:autoSpaceDN w:val="0"/>
+        <w:adjustRightInd w:val="0"/>
+        <w:spacing w:after="0" w:line="240" w:lineRule="auto"/>
         <w:rPr>
           <w:rFonts w:ascii="CMSS10" w:hAnsi="CMSS10" w:cs="CMSS10"/>
+          <w:b/>
+          <w:color w:val="000000"/>
+        </w:rPr>
+      </w:pPr>
+      <w:r>
+        <w:rPr>
+          <w:rFonts w:ascii="CMSSBX10" w:hAnsi="CMSSBX10" w:cs="CMSSBX10"/>
+          <w:b/>
+          <w:color w:val="000000"/>
+        </w:rPr>
+        <w:t>Secondary Markets:</w:t>
+      </w:r>
+      <w:r>
+        <w:rPr>
+          <w:rFonts w:ascii="CMSSBX10" w:hAnsi="CMSSBX10" w:cs="CMSSBX10"/>
+          <w:color w:val="000000"/>
+        </w:rPr>
+        <w:t xml:space="preserve"> </w:t>
+      </w:r>
+      <w:r>
+        <w:rPr>
+          <w:rFonts w:ascii="CMSS10" w:hAnsi="CMSS10" w:cs="CMSS10"/>
+          <w:color w:val="000000"/>
+        </w:rPr>
+        <w:t>Telephone Companies</w:t>
+      </w:r>
+    </w:p>
+    <w:p>
+      <w:pPr>
+        <w:autoSpaceDE w:val="0"/>
+        <w:autoSpaceDN w:val="0"/>
+        <w:adjustRightInd w:val="0"/>
+        <w:spacing w:after="0" w:line="240" w:lineRule="auto"/>
+        <w:rPr>
+          <w:rFonts w:ascii="CMSSBX10" w:hAnsi="CMSSBX10" w:cs="CMSSBX10"/>
+          <w:b/>
+          <w:color w:val="000000"/>
+        </w:rPr>
+      </w:pPr>
+      <w:r>
+        <w:rPr>
+          <w:rFonts w:ascii="CMSSBX10" w:hAnsi="CMSSBX10" w:cs="CMSSBX10"/>
+          <w:b/>
+          <w:color w:val="000000"/>
+        </w:rPr>
+        <w:t>Assumptions:</w:t>
+      </w:r>
+    </w:p>
+    <w:p>
+      <w:pPr>
+        <w:pStyle w:val="ListParagraph"/>
+        <w:numPr>
+          <w:ilvl w:val="0"/>
+          <w:numId w:val="1"/>
+        </w:numPr>
+        <w:autoSpaceDE w:val="0"/>
+        <w:autoSpaceDN w:val="0"/>
+        <w:adjustRightInd w:val="0"/>
+        <w:spacing w:after="0" w:line="240" w:lineRule="auto"/>
+        <w:rPr>
+          <w:rFonts w:ascii="CMSSBX10" w:hAnsi="CMSSBX10" w:cs="CMSSBX10"/>
+          <w:b/>
+          <w:color w:val="000000"/>
+        </w:rPr>
+      </w:pPr>
+      <w:r>
+        <w:rPr>
+          <w:rFonts w:ascii="CMSSBX10" w:hAnsi="CMSSBX10" w:cs="CMSSBX10"/>
+          <w:color w:val="000000"/>
+        </w:rPr>
+        <w:t>Single server</w:t>
+      </w:r>
+    </w:p>
+    <w:p>
+      <w:pPr>
+        <w:pStyle w:val="ListParagraph"/>
+        <w:numPr>
+          <w:ilvl w:val="0"/>
+          <w:numId w:val="1"/>
+        </w:numPr>
+        <w:autoSpaceDE w:val="0"/>
+        <w:autoSpaceDN w:val="0"/>
+        <w:adjustRightInd w:val="0"/>
+        <w:spacing w:after="0" w:line="240" w:lineRule="auto"/>
+        <w:rPr>
+          <w:rFonts w:ascii="CMSSBX10" w:hAnsi="CMSSBX10" w:cs="CMSSBX10"/>
+          <w:b/>
+          <w:color w:val="000000"/>
+        </w:rPr>
+      </w:pPr>
+      <w:r>
+        <w:rPr>
+          <w:rFonts w:ascii="CMSSBX10" w:hAnsi="CMSSBX10" w:cs="CMSSBX10"/>
+          <w:color w:val="000000"/>
+        </w:rPr>
+        <w:t>Support 100</w:t>
+      </w:r>
+      <w:r>
+        <w:rPr>
+          <w:rFonts w:ascii="CMSSBX10" w:hAnsi="CMSSBX10" w:cs="CMSSBX10"/>
+          <w:color w:val="000000"/>
+        </w:rPr>
+        <w:t>–</w:t>
+      </w:r>
+      <w:r>
+        <w:rPr>
+          <w:rFonts w:ascii="CMSSBX10" w:hAnsi="CMSSBX10" w:cs="CMSSBX10"/>
+          <w:color w:val="000000"/>
+        </w:rPr>
+        <w:t>1</w:t>
+      </w:r>
+      <w:r>
+        <w:rPr>
+          <w:rFonts w:ascii="CMSSBX10" w:hAnsi="CMSSBX10" w:cs="CMSSBX10"/>
+          <w:color w:val="000000"/>
+        </w:rPr>
+        <w:t>000 users</w:t>
+      </w:r>
+    </w:p>
+    <w:p>
+      <w:pPr>
+        <w:pStyle w:val="ListParagraph"/>
+        <w:numPr>
+          <w:ilvl w:val="0"/>
+          <w:numId w:val="1"/>
+        </w:numPr>
+        <w:autoSpaceDE w:val="0"/>
+        <w:autoSpaceDN w:val="0"/>
+        <w:adjustRightInd w:val="0"/>
+        <w:spacing w:after="0" w:line="240" w:lineRule="auto"/>
+        <w:rPr>
+          <w:rFonts w:ascii="CMSSBX10" w:hAnsi="CMSSBX10" w:cs="CMSSBX10"/>
+          <w:b/>
+          <w:color w:val="000000"/>
+        </w:rPr>
+      </w:pPr>
+      <w:r>
+        <w:rPr>
+          <w:rFonts w:ascii="CMSSBX10" w:hAnsi="CMSSBX10" w:cs="CMSSBX10"/>
+          <w:color w:val="000000"/>
+        </w:rPr>
+        <w:t>Windows</w:t>
+      </w:r>
+      <w:r>
+        <w:rPr>
+          <w:rFonts w:ascii="CMSSBX10" w:hAnsi="CMSSBX10" w:cs="CMSSBX10"/>
+          <w:color w:val="000000"/>
+        </w:rPr>
+        <w:t xml:space="preserve"> server</w:t>
+      </w:r>
+      <w:r>
+        <w:rPr>
+          <w:rFonts w:ascii="CMSSBX10" w:hAnsi="CMSSBX10" w:cs="CMSSBX10"/>
+          <w:color w:val="000000"/>
+        </w:rPr>
+        <w:t xml:space="preserve"> e</w:t>
+      </w:r>
+      <w:r>
+        <w:rPr>
+          <w:rFonts w:ascii="CMSSBX10" w:hAnsi="CMSSBX10" w:cs="CMSSBX10"/>
+          <w:color w:val="000000"/>
+        </w:rPr>
+        <w:t>nvironment</w:t>
+      </w:r>
+    </w:p>
+    <w:p>
+      <w:pPr>
+        <w:pStyle w:val="ListParagraph"/>
+        <w:autoSpaceDE w:val="0"/>
+        <w:autoSpaceDN w:val="0"/>
+        <w:adjustRightInd w:val="0"/>
+        <w:spacing w:after="0" w:line="240" w:lineRule="auto"/>
+        <w:ind w:left="0"/>
+        <w:rPr>
+          <w:rFonts w:ascii="CMSSBX10" w:hAnsi="CMSSBX10" w:cs="CMSSBX10"/>
+          <w:b/>
+          <w:color w:val="000000"/>
+        </w:rPr>
+      </w:pPr>
+      <w:r>
+        <w:rPr>
+          <w:rFonts w:ascii="CMSSBX10" w:hAnsi="CMSSBX10" w:cs="CMSSBX10"/>
+          <w:b/>
+          <w:color w:val="000000"/>
+        </w:rPr>
+        <w:t>Stakeholders:</w:t>
+      </w:r>
+    </w:p>
+    <w:p>
+      <w:pPr>
+        <w:pStyle w:val="ListParagraph"/>
+        <w:numPr>
+          <w:ilvl w:val="0"/>
+          <w:numId w:val="2"/>
+        </w:numPr>
+        <w:autoSpaceDE w:val="0"/>
+        <w:autoSpaceDN w:val="0"/>
+        <w:adjustRightInd w:val="0"/>
+        <w:spacing w:after="0" w:line="240" w:lineRule="auto"/>
+        <w:rPr>
+          <w:rFonts w:ascii="CMSSBX10" w:hAnsi="CMSSBX10" w:cs="CMSSBX10"/>
+          <w:b/>
+          <w:color w:val="000000"/>
+        </w:rPr>
+      </w:pPr>
+      <w:r>
+        <w:rPr>
+          <w:rFonts w:ascii="CMSSBX10" w:hAnsi="CMSSBX10" w:cs="CMSSBX10"/>
           <w:color w:val="000000"/>
         </w:rPr>
         <w:t>Consumers</w:t>
@@ -164,51 +399,81 @@
     </w:p>
     <w:p>
       <w:pPr>
-        <w:autoSpaceDE w:val="0"/>
-        <w:autoSpaceDN w:val="0"/>
-        <w:adjustRightInd w:val="0"/>
-        <w:spacing w:after="0" w:line="240" w:lineRule="auto"/>
-        <w:rPr>
-          <w:rFonts w:ascii="CMSS10" w:hAnsi="CMSS10" w:cs="CMSS10"/>
-          <w:b/>
-          <w:color w:val="000000"/>
-        </w:rPr>
-      </w:pPr>
-      <w:r>
-        <w:rPr>
-          <w:rFonts w:ascii="CMSSBX10" w:hAnsi="CMSSBX10" w:cs="CMSSBX10"/>
-          <w:color w:val="000000"/>
-        </w:rPr>
-        <w:t xml:space="preserve">Secondary Markets: </w:t>
-      </w:r>
-      <w:r>
-        <w:rPr>
-          <w:rFonts w:ascii="CMSS10" w:hAnsi="CMSS10" w:cs="CMSS10"/>
-          <w:color w:val="000000"/>
-        </w:rPr>
-        <w:t>Telco’s</w:t>
-      </w:r>
-    </w:p>
-    <w:p>
-      <w:pPr>
-        <w:autoSpaceDE w:val="0"/>
-        <w:autoSpaceDN w:val="0"/>
-        <w:adjustRightInd w:val="0"/>
-        <w:spacing w:after="0" w:line="240" w:lineRule="auto"/>
-        <w:rPr>
-          <w:rFonts w:ascii="CMSSBX10" w:hAnsi="CMSSBX10" w:cs="CMSSBX10"/>
-          <w:color w:val="000000"/>
-        </w:rPr>
-      </w:pPr>
-      <w:r>
-        <w:rPr>
-          <w:rFonts w:ascii="CMSSBX10" w:hAnsi="CMSSBX10" w:cs="CMSSBX10"/>
-          <w:color w:val="000000"/>
-        </w:rPr>
-        <w:t>Assumptions:</w:t>
-      </w:r>
-    </w:p>
-    <w:p/>
+        <w:pStyle w:val="ListParagraph"/>
+        <w:numPr>
+          <w:ilvl w:val="0"/>
+          <w:numId w:val="2"/>
+        </w:numPr>
+        <w:autoSpaceDE w:val="0"/>
+        <w:autoSpaceDN w:val="0"/>
+        <w:adjustRightInd w:val="0"/>
+        <w:spacing w:after="0" w:line="240" w:lineRule="auto"/>
+        <w:rPr>
+          <w:rFonts w:ascii="CMSSBX10" w:hAnsi="CMSSBX10" w:cs="CMSSBX10"/>
+          <w:b/>
+          <w:color w:val="000000"/>
+        </w:rPr>
+      </w:pPr>
+      <w:r>
+        <w:rPr>
+          <w:rFonts w:ascii="CMSSBX10" w:hAnsi="CMSSBX10" w:cs="CMSSBX10"/>
+          <w:color w:val="000000"/>
+        </w:rPr>
+        <w:t>Telephone Companies</w:t>
+      </w:r>
+    </w:p>
+    <w:p>
+      <w:pPr>
+        <w:pStyle w:val="ListParagraph"/>
+        <w:numPr>
+          <w:ilvl w:val="0"/>
+          <w:numId w:val="2"/>
+        </w:numPr>
+        <w:autoSpaceDE w:val="0"/>
+        <w:autoSpaceDN w:val="0"/>
+        <w:adjustRightInd w:val="0"/>
+        <w:spacing w:after="0" w:line="240" w:lineRule="auto"/>
+        <w:rPr>
+          <w:rFonts w:ascii="CMSSBX10" w:hAnsi="CMSSBX10" w:cs="CMSSBX10"/>
+          <w:b/>
+          <w:color w:val="000000"/>
+        </w:rPr>
+      </w:pPr>
+      <w:r>
+        <w:rPr>
+          <w:rFonts w:ascii="CMSSBX10" w:hAnsi="CMSSBX10" w:cs="CMSSBX10"/>
+          <w:color w:val="000000"/>
+        </w:rPr>
+        <w:t>Sales Team</w:t>
+      </w:r>
+    </w:p>
+    <w:p>
+      <w:pPr>
+        <w:pStyle w:val="ListParagraph"/>
+        <w:numPr>
+          <w:ilvl w:val="0"/>
+          <w:numId w:val="2"/>
+        </w:numPr>
+        <w:autoSpaceDE w:val="0"/>
+        <w:autoSpaceDN w:val="0"/>
+        <w:adjustRightInd w:val="0"/>
+        <w:spacing w:after="0" w:line="240" w:lineRule="auto"/>
+        <w:rPr>
+          <w:rFonts w:ascii="CMSSBX10" w:hAnsi="CMSSBX10" w:cs="CMSSBX10"/>
+          <w:b/>
+          <w:color w:val="000000"/>
+        </w:rPr>
+      </w:pPr>
+      <w:r>
+        <w:rPr>
+          <w:rFonts w:ascii="CMSSBX10" w:hAnsi="CMSSBX10" w:cs="CMSSBX10"/>
+          <w:color w:val="000000"/>
+        </w:rPr>
+        <w:t>Management</w:t>
+      </w:r>
+      <w:bookmarkStart w:id="0" w:name="_GoBack"/>
+      <w:bookmarkEnd w:id="0"/>
+    </w:p>
     <w:sectPr>
       <w:pgSz w:w="12240" w:h="15840"/>
       <w:pgMar w:top="1440" w:right="1440" w:bottom="1440" w:left="1440" w:header="720" w:footer="720" w:gutter="0"/>
@@ -217,6 +482,243 @@
     </w:sectPr>
   </w:body>
 </w:document>
+</file>
+
+<file path=word/numbering.xml><?xml version="1.0" encoding="utf-8"?>
+<w:numbering xmlns:wpc="http://schemas.microsoft.com/office/word/2010/wordprocessingCanvas" xmlns:mc="http://schemas.openxmlformats.org/markup-compatibility/2006" xmlns:o="urn:schemas-microsoft-com:office:office" xmlns:r="http://schemas.openxmlformats.org/officeDocument/2006/relationships" xmlns:m="http://schemas.openxmlformats.org/officeDocument/2006/math" xmlns:v="urn:schemas-microsoft-com:vml" xmlns:wp14="http://schemas.microsoft.com/office/word/2010/wordprocessingDrawing" xmlns:wp="http://schemas.openxmlformats.org/drawingml/2006/wordprocessingDrawing" xmlns:w10="urn:schemas-microsoft-com:office:word" xmlns:w="http://schemas.openxmlformats.org/wordprocessingml/2006/main" xmlns:w14="http://schemas.microsoft.com/office/word/2010/wordml" xmlns:wpg="http://schemas.microsoft.com/office/word/2010/wordprocessingGroup" xmlns:wpi="http://schemas.microsoft.com/office/word/2010/wordprocessingInk" xmlns:wne="http://schemas.microsoft.com/office/word/2006/wordml" xmlns:wps="http://schemas.microsoft.com/office/word/2010/wordprocessingShape" mc:Ignorable="w14 wp14">
+  <w:abstractNum w:abstractNumId="0">
+    <w:nsid w:val="0E8955C5"/>
+    <w:multiLevelType w:val="hybridMultilevel"/>
+    <w:tmpl w:val="D474DD76"/>
+    <w:lvl w:ilvl="0" w:tplc="0409000B">
+      <w:start w:val="1"/>
+      <w:numFmt w:val="bullet"/>
+      <w:lvlText w:val=""/>
+      <w:lvlJc w:val="left"/>
+      <w:pPr>
+        <w:ind w:left="720" w:hanging="360"/>
+      </w:pPr>
+      <w:rPr>
+        <w:rFonts w:ascii="Wingdings" w:hAnsi="Wingdings" w:hint="default"/>
+      </w:rPr>
+    </w:lvl>
+    <w:lvl w:ilvl="1" w:tplc="04090003" w:tentative="1">
+      <w:start w:val="1"/>
+      <w:numFmt w:val="bullet"/>
+      <w:lvlText w:val="o"/>
+      <w:lvlJc w:val="left"/>
+      <w:pPr>
+        <w:ind w:left="1440" w:hanging="360"/>
+      </w:pPr>
+      <w:rPr>
+        <w:rFonts w:ascii="Courier New" w:hAnsi="Courier New" w:cs="Courier New" w:hint="default"/>
+      </w:rPr>
+    </w:lvl>
+    <w:lvl w:ilvl="2" w:tplc="04090005" w:tentative="1">
+      <w:start w:val="1"/>
+      <w:numFmt w:val="bullet"/>
+      <w:lvlText w:val=""/>
+      <w:lvlJc w:val="left"/>
+      <w:pPr>
+        <w:ind w:left="2160" w:hanging="360"/>
+      </w:pPr>
+      <w:rPr>
+        <w:rFonts w:ascii="Wingdings" w:hAnsi="Wingdings" w:hint="default"/>
+      </w:rPr>
+    </w:lvl>
+    <w:lvl w:ilvl="3" w:tplc="04090001" w:tentative="1">
+      <w:start w:val="1"/>
+      <w:numFmt w:val="bullet"/>
+      <w:lvlText w:val=""/>
+      <w:lvlJc w:val="left"/>
+      <w:pPr>
+        <w:ind w:left="2880" w:hanging="360"/>
+      </w:pPr>
+      <w:rPr>
+        <w:rFonts w:ascii="Symbol" w:hAnsi="Symbol" w:hint="default"/>
+      </w:rPr>
+    </w:lvl>
+    <w:lvl w:ilvl="4" w:tplc="04090003" w:tentative="1">
+      <w:start w:val="1"/>
+      <w:numFmt w:val="bullet"/>
+      <w:lvlText w:val="o"/>
+      <w:lvlJc w:val="left"/>
+      <w:pPr>
+        <w:ind w:left="3600" w:hanging="360"/>
+      </w:pPr>
+      <w:rPr>
+        <w:rFonts w:ascii="Courier New" w:hAnsi="Courier New" w:cs="Courier New" w:hint="default"/>
+      </w:rPr>
+    </w:lvl>
+    <w:lvl w:ilvl="5" w:tplc="04090005" w:tentative="1">
+      <w:start w:val="1"/>
+      <w:numFmt w:val="bullet"/>
+      <w:lvlText w:val=""/>
+      <w:lvlJc w:val="left"/>
+      <w:pPr>
+        <w:ind w:left="4320" w:hanging="360"/>
+      </w:pPr>
+      <w:rPr>
+        <w:rFonts w:ascii="Wingdings" w:hAnsi="Wingdings" w:hint="default"/>
+      </w:rPr>
+    </w:lvl>
+    <w:lvl w:ilvl="6" w:tplc="04090001" w:tentative="1">
+      <w:start w:val="1"/>
+      <w:numFmt w:val="bullet"/>
+      <w:lvlText w:val=""/>
+      <w:lvlJc w:val="left"/>
+      <w:pPr>
+        <w:ind w:left="5040" w:hanging="360"/>
+      </w:pPr>
+      <w:rPr>
+        <w:rFonts w:ascii="Symbol" w:hAnsi="Symbol" w:hint="default"/>
+      </w:rPr>
+    </w:lvl>
+    <w:lvl w:ilvl="7" w:tplc="04090003" w:tentative="1">
+      <w:start w:val="1"/>
+      <w:numFmt w:val="bullet"/>
+      <w:lvlText w:val="o"/>
+      <w:lvlJc w:val="left"/>
+      <w:pPr>
+        <w:ind w:left="5760" w:hanging="360"/>
+      </w:pPr>
+      <w:rPr>
+        <w:rFonts w:ascii="Courier New" w:hAnsi="Courier New" w:cs="Courier New" w:hint="default"/>
+      </w:rPr>
+    </w:lvl>
+    <w:lvl w:ilvl="8" w:tplc="04090005" w:tentative="1">
+      <w:start w:val="1"/>
+      <w:numFmt w:val="bullet"/>
+      <w:lvlText w:val=""/>
+      <w:lvlJc w:val="left"/>
+      <w:pPr>
+        <w:ind w:left="6480" w:hanging="360"/>
+      </w:pPr>
+      <w:rPr>
+        <w:rFonts w:ascii="Wingdings" w:hAnsi="Wingdings" w:hint="default"/>
+      </w:rPr>
+    </w:lvl>
+  </w:abstractNum>
+  <w:abstractNum w:abstractNumId="1">
+    <w:nsid w:val="64ED1D72"/>
+    <w:multiLevelType w:val="hybridMultilevel"/>
+    <w:tmpl w:val="C6DEC0C2"/>
+    <w:lvl w:ilvl="0" w:tplc="0409000B">
+      <w:start w:val="1"/>
+      <w:numFmt w:val="bullet"/>
+      <w:lvlText w:val=""/>
+      <w:lvlJc w:val="left"/>
+      <w:pPr>
+        <w:ind w:left="720" w:hanging="360"/>
+      </w:pPr>
+      <w:rPr>
+        <w:rFonts w:ascii="Wingdings" w:hAnsi="Wingdings" w:hint="default"/>
+      </w:rPr>
+    </w:lvl>
+    <w:lvl w:ilvl="1" w:tplc="04090003" w:tentative="1">
+      <w:start w:val="1"/>
+      <w:numFmt w:val="bullet"/>
+      <w:lvlText w:val="o"/>
+      <w:lvlJc w:val="left"/>
+      <w:pPr>
+        <w:ind w:left="1440" w:hanging="360"/>
+      </w:pPr>
+      <w:rPr>
+        <w:rFonts w:ascii="Courier New" w:hAnsi="Courier New" w:cs="Courier New" w:hint="default"/>
+      </w:rPr>
+    </w:lvl>
+    <w:lvl w:ilvl="2" w:tplc="04090005" w:tentative="1">
+      <w:start w:val="1"/>
+      <w:numFmt w:val="bullet"/>
+      <w:lvlText w:val=""/>
+      <w:lvlJc w:val="left"/>
+      <w:pPr>
+        <w:ind w:left="2160" w:hanging="360"/>
+      </w:pPr>
+      <w:rPr>
+        <w:rFonts w:ascii="Wingdings" w:hAnsi="Wingdings" w:hint="default"/>
+      </w:rPr>
+    </w:lvl>
+    <w:lvl w:ilvl="3" w:tplc="04090001" w:tentative="1">
+      <w:start w:val="1"/>
+      <w:numFmt w:val="bullet"/>
+      <w:lvlText w:val=""/>
+      <w:lvlJc w:val="left"/>
+      <w:pPr>
+        <w:ind w:left="2880" w:hanging="360"/>
+      </w:pPr>
+      <w:rPr>
+        <w:rFonts w:ascii="Symbol" w:hAnsi="Symbol" w:hint="default"/>
+      </w:rPr>
+    </w:lvl>
+    <w:lvl w:ilvl="4" w:tplc="04090003" w:tentative="1">
+      <w:start w:val="1"/>
+      <w:numFmt w:val="bullet"/>
+      <w:lvlText w:val="o"/>
+      <w:lvlJc w:val="left"/>
+      <w:pPr>
+        <w:ind w:left="3600" w:hanging="360"/>
+      </w:pPr>
+      <w:rPr>
+        <w:rFonts w:ascii="Courier New" w:hAnsi="Courier New" w:cs="Courier New" w:hint="default"/>
+      </w:rPr>
+    </w:lvl>
+    <w:lvl w:ilvl="5" w:tplc="04090005" w:tentative="1">
+      <w:start w:val="1"/>
+      <w:numFmt w:val="bullet"/>
+      <w:lvlText w:val=""/>
+      <w:lvlJc w:val="left"/>
+      <w:pPr>
+        <w:ind w:left="4320" w:hanging="360"/>
+      </w:pPr>
+      <w:rPr>
+        <w:rFonts w:ascii="Wingdings" w:hAnsi="Wingdings" w:hint="default"/>
+      </w:rPr>
+    </w:lvl>
+    <w:lvl w:ilvl="6" w:tplc="04090001" w:tentative="1">
+      <w:start w:val="1"/>
+      <w:numFmt w:val="bullet"/>
+      <w:lvlText w:val=""/>
+      <w:lvlJc w:val="left"/>
+      <w:pPr>
+        <w:ind w:left="5040" w:hanging="360"/>
+      </w:pPr>
+      <w:rPr>
+        <w:rFonts w:ascii="Symbol" w:hAnsi="Symbol" w:hint="default"/>
+      </w:rPr>
+    </w:lvl>
+    <w:lvl w:ilvl="7" w:tplc="04090003" w:tentative="1">
+      <w:start w:val="1"/>
+      <w:numFmt w:val="bullet"/>
+      <w:lvlText w:val="o"/>
+      <w:lvlJc w:val="left"/>
+      <w:pPr>
+        <w:ind w:left="5760" w:hanging="360"/>
+      </w:pPr>
+      <w:rPr>
+        <w:rFonts w:ascii="Courier New" w:hAnsi="Courier New" w:cs="Courier New" w:hint="default"/>
+      </w:rPr>
+    </w:lvl>
+    <w:lvl w:ilvl="8" w:tplc="04090005" w:tentative="1">
+      <w:start w:val="1"/>
+      <w:numFmt w:val="bullet"/>
+      <w:lvlText w:val=""/>
+      <w:lvlJc w:val="left"/>
+      <w:pPr>
+        <w:ind w:left="6480" w:hanging="360"/>
+      </w:pPr>
+      <w:rPr>
+        <w:rFonts w:ascii="Wingdings" w:hAnsi="Wingdings" w:hint="default"/>
+      </w:rPr>
+    </w:lvl>
+  </w:abstractNum>
+  <w:num w:numId="1">
+    <w:abstractNumId w:val="0"/>
+  </w:num>
+  <w:num w:numId="2">
+    <w:abstractNumId w:val="1"/>
+  </w:num>
+</w:numbering>
 </file>
 
 <file path=word/styles.xml><?xml version="1.0" encoding="utf-8"?>
@@ -406,6 +908,17 @@
     <w:semiHidden/>
     <w:unhideWhenUsed/>
   </w:style>
+  <w:style w:type="paragraph" w:styleId="ListParagraph">
+    <w:name w:val="List Paragraph"/>
+    <w:basedOn w:val="Normal"/>
+    <w:uiPriority w:val="34"/>
+    <w:qFormat/>
+    <w:rsid w:val="007F7DD9"/>
+    <w:pPr>
+      <w:ind w:left="720"/>
+      <w:contextualSpacing/>
+    </w:pPr>
+  </w:style>
 </w:styles>
 </file>
 
@@ -595,6 +1108,17 @@
     <w:uiPriority w:val="99"/>
     <w:semiHidden/>
     <w:unhideWhenUsed/>
+  </w:style>
+  <w:style w:type="paragraph" w:styleId="ListParagraph">
+    <w:name w:val="List Paragraph"/>
+    <w:basedOn w:val="Normal"/>
+    <w:uiPriority w:val="34"/>
+    <w:qFormat/>
+    <w:rsid w:val="007F7DD9"/>
+    <w:pPr>
+      <w:ind w:left="720"/>
+      <w:contextualSpacing/>
+    </w:pPr>
   </w:style>
 </w:styles>
 </file>

</xml_diff>

<commit_message>
Cleaned up the mission statement
Added the certifications category and cleaned up the product description
</commit_message>
<xml_diff>
--- a/srDesign_MissonStatement.docx
+++ b/srDesign_MissonStatement.docx
@@ -30,6 +30,20 @@
         <w:adjustRightInd w:val="0"/>
         <w:spacing w:after="0" w:line="240" w:lineRule="auto"/>
         <w:rPr>
+          <w:rFonts w:ascii="CMSSBX10" w:hAnsi="CMSSBX10" w:cs="CMSSBX10"/>
+          <w:b/>
+          <w:color w:val="000000"/>
+        </w:rPr>
+      </w:pPr>
+    </w:p>
+    <w:p>
+      <w:pPr>
+        <w:autoSpaceDE w:val="0"/>
+        <w:autoSpaceDN w:val="0"/>
+        <w:adjustRightInd w:val="0"/>
+        <w:spacing w:after="0" w:line="240" w:lineRule="auto"/>
+        <w:ind w:left="2250" w:hanging="2250"/>
+        <w:rPr>
           <w:rFonts w:ascii="CMSS10" w:hAnsi="CMSS10" w:cs="CMSS10"/>
           <w:color w:val="000000"/>
         </w:rPr>
@@ -54,20 +68,24 @@
           <w:rFonts w:ascii="CMSS10" w:hAnsi="CMSS10" w:cs="CMSS10"/>
           <w:color w:val="000000"/>
         </w:rPr>
-        <w:t>A plugin based server for hosting and controlling multiplayer games for STBs</w:t>
-      </w:r>
-    </w:p>
-    <w:p>
-      <w:pPr>
-        <w:autoSpaceDE w:val="0"/>
-        <w:autoSpaceDN w:val="0"/>
-        <w:adjustRightInd w:val="0"/>
-        <w:spacing w:after="0" w:line="240" w:lineRule="auto"/>
+        <w:t>A plugin based server for hosting and contro</w:t>
+      </w:r>
+      <w:r>
         <w:rPr>
           <w:rFonts w:ascii="CMSS10" w:hAnsi="CMSS10" w:cs="CMSS10"/>
           <w:color w:val="000000"/>
         </w:rPr>
-      </w:pPr>
+        <w:t>lling multiplayer games for Set Top Boxes</w:t>
+      </w:r>
+      <w:r>
+        <w:rPr>
+          <w:rFonts w:ascii="CMSS10" w:hAnsi="CMSS10" w:cs="CMSS10"/>
+          <w:color w:val="000000"/>
+        </w:rPr>
+        <w:t xml:space="preserve"> in an APMax environment</w:t>
+      </w:r>
+      <w:bookmarkStart w:id="0" w:name="_GoBack"/>
+      <w:bookmarkEnd w:id="0"/>
     </w:p>
     <w:p>
       <w:pPr>
@@ -471,8 +489,29 @@
         </w:rPr>
         <w:t>Management</w:t>
       </w:r>
-      <w:bookmarkStart w:id="0" w:name="_GoBack"/>
-      <w:bookmarkEnd w:id="0"/>
+    </w:p>
+    <w:p>
+      <w:pPr>
+        <w:pStyle w:val="ListParagraph"/>
+        <w:autoSpaceDE w:val="0"/>
+        <w:autoSpaceDN w:val="0"/>
+        <w:adjustRightInd w:val="0"/>
+        <w:spacing w:after="0" w:line="240" w:lineRule="auto"/>
+        <w:ind w:hanging="720"/>
+        <w:rPr>
+          <w:rFonts w:ascii="CMSSBX10" w:hAnsi="CMSSBX10" w:cs="CMSSBX10"/>
+          <w:b/>
+          <w:color w:val="000000"/>
+        </w:rPr>
+      </w:pPr>
+      <w:r>
+        <w:rPr>
+          <w:rFonts w:ascii="CMSSBX10" w:hAnsi="CMSSBX10" w:cs="CMSSBX10"/>
+          <w:b/>
+          <w:color w:val="000000"/>
+        </w:rPr>
+        <w:t>Certifications:</w:t>
+      </w:r>
     </w:p>
     <w:sectPr>
       <w:pgSz w:w="12240" w:h="15840"/>

</xml_diff>

<commit_message>
removed ~ files :), reformated mission statement, design documents
</commit_message>
<xml_diff>
--- a/srDesign_MissonStatement.docx
+++ b/srDesign_MissonStatement.docx
@@ -4,6 +4,349 @@
   <w:body>
     <w:p>
       <w:pPr>
+        <w:pStyle w:val="Title"/>
+        <w:pBdr>
+          <w:bottom w:val="single" w:sz="8" w:space="3" w:color="4F81BD" w:themeColor="accent1"/>
+        </w:pBdr>
+        <w:jc w:val="right"/>
+      </w:pPr>
+      <w:r>
+        <w:rPr>
+          <w:noProof/>
+        </w:rPr>
+        <w:drawing>
+          <wp:inline distT="0" distB="0" distL="0" distR="0" wp14:anchorId="1BADEF93" wp14:editId="7ACC8BED">
+            <wp:extent cx="2539683" cy="850794"/>
+            <wp:effectExtent l="0" t="0" r="0" b="6985"/>
+            <wp:docPr id="3" name="Picture 3"/>
+            <wp:cNvGraphicFramePr>
+              <a:graphicFrameLocks xmlns:a="http://schemas.openxmlformats.org/drawingml/2006/main" noChangeAspect="1"/>
+            </wp:cNvGraphicFramePr>
+            <a:graphic xmlns:a="http://schemas.openxmlformats.org/drawingml/2006/main">
+              <a:graphicData uri="http://schemas.openxmlformats.org/drawingml/2006/picture">
+                <pic:pic xmlns:pic="http://schemas.openxmlformats.org/drawingml/2006/picture">
+                  <pic:nvPicPr>
+                    <pic:cNvPr id="0" name="innovative-systems.png"/>
+                    <pic:cNvPicPr/>
+                  </pic:nvPicPr>
+                  <pic:blipFill>
+                    <a:blip r:embed="rId6">
+                      <a:extLst>
+                        <a:ext uri="{28A0092B-C50C-407E-A947-70E740481C1C}">
+                          <a14:useLocalDpi xmlns:a14="http://schemas.microsoft.com/office/drawing/2010/main" val="0"/>
+                        </a:ext>
+                      </a:extLst>
+                    </a:blip>
+                    <a:stretch>
+                      <a:fillRect/>
+                    </a:stretch>
+                  </pic:blipFill>
+                  <pic:spPr>
+                    <a:xfrm>
+                      <a:off x="0" y="0"/>
+                      <a:ext cx="2539683" cy="850794"/>
+                    </a:xfrm>
+                    <a:prstGeom prst="rect">
+                      <a:avLst/>
+                    </a:prstGeom>
+                  </pic:spPr>
+                </pic:pic>
+              </a:graphicData>
+            </a:graphic>
+          </wp:inline>
+        </w:drawing>
+      </w:r>
+    </w:p>
+    <w:p>
+      <w:pPr>
+        <w:pStyle w:val="Title"/>
+        <w:pBdr>
+          <w:bottom w:val="single" w:sz="8" w:space="3" w:color="4F81BD" w:themeColor="accent1"/>
+        </w:pBdr>
+        <w:jc w:val="right"/>
+      </w:pPr>
+    </w:p>
+    <w:p>
+      <w:pPr>
+        <w:pStyle w:val="Title"/>
+        <w:pBdr>
+          <w:bottom w:val="single" w:sz="8" w:space="3" w:color="4F81BD" w:themeColor="accent1"/>
+        </w:pBdr>
+        <w:jc w:val="right"/>
+      </w:pPr>
+      <w:r>
+        <w:t>Mission Statement</w:t>
+      </w:r>
+      <w:r>
+        <w:t xml:space="preserve"> Document </w:t>
+      </w:r>
+    </w:p>
+    <w:p>
+      <w:pPr>
+        <w:pStyle w:val="Subtitle"/>
+        <w:jc w:val="right"/>
+        <w:rPr>
+          <w:rStyle w:val="IntenseEmphasis"/>
+          <w:b w:val="0"/>
+          <w:bCs w:val="0"/>
+        </w:rPr>
+      </w:pPr>
+      <w:r>
+        <w:rPr>
+          <w:rStyle w:val="IntenseEmphasis"/>
+        </w:rPr>
+        <w:t>STBMF</w:t>
+      </w:r>
+    </w:p>
+    <w:p>
+      <w:pPr>
+        <w:pStyle w:val="Subtitle"/>
+        <w:jc w:val="right"/>
+        <w:rPr>
+          <w:rStyle w:val="IntenseEmphasis"/>
+          <w:b w:val="0"/>
+          <w:bCs w:val="0"/>
+        </w:rPr>
+      </w:pPr>
+      <w:r>
+        <w:rPr>
+          <w:rStyle w:val="IntenseEmphasis"/>
+        </w:rPr>
+        <w:t xml:space="preserve">David </w:t>
+      </w:r>
+      <w:proofErr w:type="spellStart"/>
+      <w:r>
+        <w:rPr>
+          <w:rStyle w:val="IntenseEmphasis"/>
+        </w:rPr>
+        <w:t>Jarman</w:t>
+      </w:r>
+      <w:proofErr w:type="spellEnd"/>
+    </w:p>
+    <w:p>
+      <w:pPr>
+        <w:pStyle w:val="Subtitle"/>
+        <w:jc w:val="right"/>
+        <w:rPr>
+          <w:rStyle w:val="IntenseEmphasis"/>
+          <w:b w:val="0"/>
+          <w:bCs w:val="0"/>
+        </w:rPr>
+      </w:pPr>
+      <w:r>
+        <w:rPr>
+          <w:rStyle w:val="IntenseEmphasis"/>
+        </w:rPr>
+        <w:t xml:space="preserve">Kevin </w:t>
+      </w:r>
+      <w:proofErr w:type="spellStart"/>
+      <w:r>
+        <w:rPr>
+          <w:rStyle w:val="IntenseEmphasis"/>
+        </w:rPr>
+        <w:t>Worner</w:t>
+      </w:r>
+      <w:proofErr w:type="spellEnd"/>
+    </w:p>
+    <w:p>
+      <w:pPr>
+        <w:pStyle w:val="Subtitle"/>
+        <w:jc w:val="right"/>
+        <w:rPr>
+          <w:i w:val="0"/>
+        </w:rPr>
+      </w:pPr>
+      <w:r>
+        <w:rPr>
+          <w:rStyle w:val="IntenseEmphasis"/>
+        </w:rPr>
+        <w:t>Marshall Gaucher</w:t>
+      </w:r>
+    </w:p>
+    <w:p>
+      <w:pPr>
+        <w:autoSpaceDE w:val="0"/>
+        <w:autoSpaceDN w:val="0"/>
+        <w:adjustRightInd w:val="0"/>
+        <w:spacing w:after="0" w:line="240" w:lineRule="auto"/>
+        <w:rPr>
+          <w:rFonts w:ascii="CMSS12" w:hAnsi="CMSS12" w:cs="CMSS12"/>
+          <w:color w:val="F7CE03"/>
+          <w:sz w:val="29"/>
+          <w:szCs w:val="29"/>
+        </w:rPr>
+      </w:pPr>
+    </w:p>
+    <w:p>
+      <w:pPr>
+        <w:autoSpaceDE w:val="0"/>
+        <w:autoSpaceDN w:val="0"/>
+        <w:adjustRightInd w:val="0"/>
+        <w:spacing w:after="0" w:line="240" w:lineRule="auto"/>
+        <w:rPr>
+          <w:rFonts w:ascii="CMSS12" w:hAnsi="CMSS12" w:cs="CMSS12"/>
+          <w:color w:val="F7CE03"/>
+          <w:sz w:val="29"/>
+          <w:szCs w:val="29"/>
+        </w:rPr>
+      </w:pPr>
+    </w:p>
+    <w:p>
+      <w:pPr>
+        <w:autoSpaceDE w:val="0"/>
+        <w:autoSpaceDN w:val="0"/>
+        <w:adjustRightInd w:val="0"/>
+        <w:spacing w:after="0" w:line="240" w:lineRule="auto"/>
+        <w:rPr>
+          <w:rFonts w:ascii="CMSS12" w:hAnsi="CMSS12" w:cs="CMSS12"/>
+          <w:color w:val="F7CE03"/>
+          <w:sz w:val="29"/>
+          <w:szCs w:val="29"/>
+        </w:rPr>
+      </w:pPr>
+    </w:p>
+    <w:p>
+      <w:pPr>
+        <w:autoSpaceDE w:val="0"/>
+        <w:autoSpaceDN w:val="0"/>
+        <w:adjustRightInd w:val="0"/>
+        <w:spacing w:after="0" w:line="240" w:lineRule="auto"/>
+        <w:rPr>
+          <w:rFonts w:ascii="CMSS12" w:hAnsi="CMSS12" w:cs="CMSS12"/>
+          <w:color w:val="F7CE03"/>
+          <w:sz w:val="29"/>
+          <w:szCs w:val="29"/>
+        </w:rPr>
+      </w:pPr>
+    </w:p>
+    <w:p>
+      <w:pPr>
+        <w:autoSpaceDE w:val="0"/>
+        <w:autoSpaceDN w:val="0"/>
+        <w:adjustRightInd w:val="0"/>
+        <w:spacing w:after="0" w:line="240" w:lineRule="auto"/>
+        <w:rPr>
+          <w:rFonts w:ascii="CMSS12" w:hAnsi="CMSS12" w:cs="CMSS12"/>
+          <w:color w:val="F7CE03"/>
+          <w:sz w:val="29"/>
+          <w:szCs w:val="29"/>
+        </w:rPr>
+      </w:pPr>
+    </w:p>
+    <w:p>
+      <w:pPr>
+        <w:autoSpaceDE w:val="0"/>
+        <w:autoSpaceDN w:val="0"/>
+        <w:adjustRightInd w:val="0"/>
+        <w:spacing w:after="0" w:line="240" w:lineRule="auto"/>
+        <w:rPr>
+          <w:rFonts w:ascii="CMSS12" w:hAnsi="CMSS12" w:cs="CMSS12"/>
+          <w:color w:val="F7CE03"/>
+          <w:sz w:val="29"/>
+          <w:szCs w:val="29"/>
+        </w:rPr>
+      </w:pPr>
+    </w:p>
+    <w:p>
+      <w:pPr>
+        <w:autoSpaceDE w:val="0"/>
+        <w:autoSpaceDN w:val="0"/>
+        <w:adjustRightInd w:val="0"/>
+        <w:spacing w:after="0" w:line="240" w:lineRule="auto"/>
+        <w:rPr>
+          <w:rFonts w:ascii="CMSS12" w:hAnsi="CMSS12" w:cs="CMSS12"/>
+          <w:color w:val="F7CE03"/>
+          <w:sz w:val="29"/>
+          <w:szCs w:val="29"/>
+        </w:rPr>
+      </w:pPr>
+    </w:p>
+    <w:p>
+      <w:pPr>
+        <w:autoSpaceDE w:val="0"/>
+        <w:autoSpaceDN w:val="0"/>
+        <w:adjustRightInd w:val="0"/>
+        <w:spacing w:after="0" w:line="240" w:lineRule="auto"/>
+        <w:rPr>
+          <w:rFonts w:ascii="CMSS12" w:hAnsi="CMSS12" w:cs="CMSS12"/>
+          <w:color w:val="F7CE03"/>
+          <w:sz w:val="29"/>
+          <w:szCs w:val="29"/>
+        </w:rPr>
+      </w:pPr>
+    </w:p>
+    <w:p>
+      <w:pPr>
+        <w:autoSpaceDE w:val="0"/>
+        <w:autoSpaceDN w:val="0"/>
+        <w:adjustRightInd w:val="0"/>
+        <w:spacing w:after="0" w:line="240" w:lineRule="auto"/>
+        <w:rPr>
+          <w:rFonts w:ascii="CMSS12" w:hAnsi="CMSS12" w:cs="CMSS12"/>
+          <w:color w:val="F7CE03"/>
+          <w:sz w:val="29"/>
+          <w:szCs w:val="29"/>
+        </w:rPr>
+      </w:pPr>
+    </w:p>
+    <w:p>
+      <w:pPr>
+        <w:autoSpaceDE w:val="0"/>
+        <w:autoSpaceDN w:val="0"/>
+        <w:adjustRightInd w:val="0"/>
+        <w:spacing w:after="0" w:line="240" w:lineRule="auto"/>
+        <w:rPr>
+          <w:rFonts w:ascii="CMSS12" w:hAnsi="CMSS12" w:cs="CMSS12"/>
+          <w:color w:val="F7CE03"/>
+          <w:sz w:val="29"/>
+          <w:szCs w:val="29"/>
+        </w:rPr>
+      </w:pPr>
+    </w:p>
+    <w:p>
+      <w:pPr>
+        <w:autoSpaceDE w:val="0"/>
+        <w:autoSpaceDN w:val="0"/>
+        <w:adjustRightInd w:val="0"/>
+        <w:spacing w:after="0" w:line="240" w:lineRule="auto"/>
+        <w:rPr>
+          <w:rFonts w:ascii="CMSS12" w:hAnsi="CMSS12" w:cs="CMSS12"/>
+          <w:color w:val="F7CE03"/>
+          <w:sz w:val="29"/>
+          <w:szCs w:val="29"/>
+        </w:rPr>
+      </w:pPr>
+    </w:p>
+    <w:p>
+      <w:pPr>
+        <w:autoSpaceDE w:val="0"/>
+        <w:autoSpaceDN w:val="0"/>
+        <w:adjustRightInd w:val="0"/>
+        <w:spacing w:after="0" w:line="240" w:lineRule="auto"/>
+        <w:rPr>
+          <w:rFonts w:ascii="CMSS12" w:hAnsi="CMSS12" w:cs="CMSS12"/>
+          <w:color w:val="F7CE03"/>
+          <w:sz w:val="29"/>
+          <w:szCs w:val="29"/>
+        </w:rPr>
+      </w:pPr>
+    </w:p>
+    <w:p>
+      <w:pPr>
+        <w:autoSpaceDE w:val="0"/>
+        <w:autoSpaceDN w:val="0"/>
+        <w:adjustRightInd w:val="0"/>
+        <w:spacing w:after="0" w:line="240" w:lineRule="auto"/>
+        <w:rPr>
+          <w:rFonts w:ascii="CMSS12" w:hAnsi="CMSS12" w:cs="CMSS12"/>
+          <w:color w:val="F7CE03"/>
+          <w:sz w:val="29"/>
+          <w:szCs w:val="29"/>
+        </w:rPr>
+      </w:pPr>
+    </w:p>
+    <w:p>
+      <w:pPr>
         <w:autoSpaceDE w:val="0"/>
         <w:autoSpaceDN w:val="0"/>
         <w:adjustRightInd w:val="0"/>
@@ -14,14 +357,19 @@
           <w:color w:val="000000"/>
         </w:rPr>
       </w:pPr>
-      <w:r>
+    </w:p>
+    <w:p>
+      <w:pPr>
+        <w:autoSpaceDE w:val="0"/>
+        <w:autoSpaceDN w:val="0"/>
+        <w:adjustRightInd w:val="0"/>
+        <w:spacing w:after="0" w:line="240" w:lineRule="auto"/>
         <w:rPr>
           <w:rFonts w:ascii="CMSSBX10" w:hAnsi="CMSSBX10" w:cs="CMSSBX10"/>
           <w:b/>
           <w:color w:val="000000"/>
         </w:rPr>
-        <w:t>Mission Statement for the Set Top Box Multiplayer Framework</w:t>
-      </w:r>
+      </w:pPr>
     </w:p>
     <w:p>
       <w:pPr>
@@ -42,50 +390,12 @@
         <w:autoSpaceDN w:val="0"/>
         <w:adjustRightInd w:val="0"/>
         <w:spacing w:after="0" w:line="240" w:lineRule="auto"/>
-        <w:ind w:left="2250" w:hanging="2250"/>
-        <w:rPr>
-          <w:rFonts w:ascii="CMSS10" w:hAnsi="CMSS10" w:cs="CMSS10"/>
-          <w:color w:val="000000"/>
-        </w:rPr>
-      </w:pPr>
-      <w:r>
         <w:rPr>
           <w:rFonts w:ascii="CMSSBX10" w:hAnsi="CMSSBX10" w:cs="CMSSBX10"/>
           <w:b/>
           <w:color w:val="000000"/>
         </w:rPr>
-        <w:t>Product Description:</w:t>
-      </w:r>
-      <w:r>
-        <w:rPr>
-          <w:rFonts w:ascii="CMSSBX10" w:hAnsi="CMSSBX10" w:cs="CMSSBX10"/>
-          <w:color w:val="000000"/>
-        </w:rPr>
-        <w:t xml:space="preserve"> </w:t>
-      </w:r>
-      <w:r>
-        <w:rPr>
-          <w:rFonts w:ascii="CMSS10" w:hAnsi="CMSS10" w:cs="CMSS10"/>
-          <w:color w:val="000000"/>
-        </w:rPr>
-        <w:t>A plugin based server for hosting and contro</w:t>
-      </w:r>
-      <w:r>
-        <w:rPr>
-          <w:rFonts w:ascii="CMSS10" w:hAnsi="CMSS10" w:cs="CMSS10"/>
-          <w:color w:val="000000"/>
-        </w:rPr>
-        <w:t>lling multiplayer games for Set Top Boxes</w:t>
-      </w:r>
-      <w:r>
-        <w:rPr>
-          <w:rFonts w:ascii="CMSS10" w:hAnsi="CMSS10" w:cs="CMSS10"/>
-          <w:color w:val="000000"/>
-        </w:rPr>
-        <w:t xml:space="preserve"> in an APMax environment</w:t>
-      </w:r>
-      <w:bookmarkStart w:id="0" w:name="_GoBack"/>
-      <w:bookmarkEnd w:id="0"/>
+      </w:pPr>
     </w:p>
     <w:p>
       <w:pPr>
@@ -99,12 +409,226 @@
           <w:color w:val="000000"/>
         </w:rPr>
       </w:pPr>
-      <w:r>
+    </w:p>
+    <w:p>
+      <w:pPr>
+        <w:autoSpaceDE w:val="0"/>
+        <w:autoSpaceDN w:val="0"/>
+        <w:adjustRightInd w:val="0"/>
+        <w:spacing w:after="0" w:line="240" w:lineRule="auto"/>
         <w:rPr>
           <w:rFonts w:ascii="CMSSBX10" w:hAnsi="CMSSBX10" w:cs="CMSSBX10"/>
           <w:b/>
           <w:color w:val="000000"/>
         </w:rPr>
+      </w:pPr>
+    </w:p>
+    <w:p>
+      <w:pPr>
+        <w:autoSpaceDE w:val="0"/>
+        <w:autoSpaceDN w:val="0"/>
+        <w:adjustRightInd w:val="0"/>
+        <w:spacing w:after="0" w:line="240" w:lineRule="auto"/>
+        <w:rPr>
+          <w:rFonts w:ascii="CMSSBX10" w:hAnsi="CMSSBX10" w:cs="CMSSBX10"/>
+          <w:b/>
+          <w:color w:val="000000"/>
+        </w:rPr>
+      </w:pPr>
+    </w:p>
+    <w:p>
+      <w:pPr>
+        <w:autoSpaceDE w:val="0"/>
+        <w:autoSpaceDN w:val="0"/>
+        <w:adjustRightInd w:val="0"/>
+        <w:spacing w:after="0" w:line="240" w:lineRule="auto"/>
+        <w:rPr>
+          <w:rFonts w:ascii="CMSSBX10" w:hAnsi="CMSSBX10" w:cs="CMSSBX10"/>
+          <w:b/>
+          <w:color w:val="000000"/>
+        </w:rPr>
+      </w:pPr>
+    </w:p>
+    <w:p>
+      <w:pPr>
+        <w:autoSpaceDE w:val="0"/>
+        <w:autoSpaceDN w:val="0"/>
+        <w:adjustRightInd w:val="0"/>
+        <w:spacing w:after="0" w:line="240" w:lineRule="auto"/>
+        <w:rPr>
+          <w:rFonts w:ascii="CMSSBX10" w:hAnsi="CMSSBX10" w:cs="CMSSBX10"/>
+          <w:b/>
+          <w:color w:val="000000"/>
+        </w:rPr>
+      </w:pPr>
+    </w:p>
+    <w:p>
+      <w:pPr>
+        <w:autoSpaceDE w:val="0"/>
+        <w:autoSpaceDN w:val="0"/>
+        <w:adjustRightInd w:val="0"/>
+        <w:spacing w:after="0" w:line="240" w:lineRule="auto"/>
+        <w:rPr>
+          <w:rFonts w:ascii="CMSSBX10" w:hAnsi="CMSSBX10" w:cs="CMSSBX10"/>
+          <w:b/>
+          <w:color w:val="000000"/>
+        </w:rPr>
+      </w:pPr>
+    </w:p>
+    <w:p>
+      <w:pPr>
+        <w:autoSpaceDE w:val="0"/>
+        <w:autoSpaceDN w:val="0"/>
+        <w:adjustRightInd w:val="0"/>
+        <w:spacing w:after="0" w:line="240" w:lineRule="auto"/>
+        <w:rPr>
+          <w:rFonts w:ascii="CMSSBX10" w:hAnsi="CMSSBX10" w:cs="CMSSBX10"/>
+          <w:b/>
+          <w:color w:val="000000"/>
+        </w:rPr>
+      </w:pPr>
+    </w:p>
+    <w:p>
+      <w:pPr>
+        <w:autoSpaceDE w:val="0"/>
+        <w:autoSpaceDN w:val="0"/>
+        <w:adjustRightInd w:val="0"/>
+        <w:spacing w:after="0" w:line="240" w:lineRule="auto"/>
+        <w:rPr>
+          <w:rFonts w:ascii="CMSSBX10" w:hAnsi="CMSSBX10" w:cs="CMSSBX10"/>
+          <w:b/>
+          <w:color w:val="000000"/>
+        </w:rPr>
+      </w:pPr>
+    </w:p>
+    <w:p>
+      <w:pPr>
+        <w:autoSpaceDE w:val="0"/>
+        <w:autoSpaceDN w:val="0"/>
+        <w:adjustRightInd w:val="0"/>
+        <w:spacing w:after="0" w:line="240" w:lineRule="auto"/>
+        <w:rPr>
+          <w:rFonts w:ascii="CMSSBX10" w:hAnsi="CMSSBX10" w:cs="CMSSBX10"/>
+          <w:b/>
+          <w:color w:val="000000"/>
+        </w:rPr>
+      </w:pPr>
+    </w:p>
+    <w:p>
+      <w:pPr>
+        <w:autoSpaceDE w:val="0"/>
+        <w:autoSpaceDN w:val="0"/>
+        <w:adjustRightInd w:val="0"/>
+        <w:spacing w:after="0" w:line="240" w:lineRule="auto"/>
+        <w:rPr>
+          <w:rFonts w:ascii="CMSSBX10" w:hAnsi="CMSSBX10" w:cs="CMSSBX10"/>
+          <w:b/>
+          <w:color w:val="000000"/>
+        </w:rPr>
+      </w:pPr>
+    </w:p>
+    <w:p>
+      <w:pPr>
+        <w:pStyle w:val="Heading1"/>
+        <w:spacing w:before="0"/>
+      </w:pPr>
+      <w:r>
+        <w:lastRenderedPageBreak/>
+        <w:t>Mission Statement for the Set Top Box Multiplayer Framework</w:t>
+      </w:r>
+    </w:p>
+    <w:p>
+      <w:pPr>
+        <w:pStyle w:val="Heading2"/>
+        <w:rPr>
+          <w:rFonts w:cs="CMSSBX10"/>
+          <w:b w:val="0"/>
+          <w:color w:val="000000"/>
+        </w:rPr>
+      </w:pPr>
+      <w:r>
+        <w:rPr>
+          <w:rStyle w:val="Heading2Char"/>
+          <w:b/>
+        </w:rPr>
+        <w:t>Product Description:</w:t>
+      </w:r>
+      <w:r>
+        <w:rPr>
+          <w:rFonts w:cs="CMSSBX10"/>
+          <w:b w:val="0"/>
+          <w:color w:val="000000"/>
+        </w:rPr>
+        <w:t xml:space="preserve"> </w:t>
+      </w:r>
+    </w:p>
+    <w:p>
+      <w:pPr>
+        <w:autoSpaceDE w:val="0"/>
+        <w:autoSpaceDN w:val="0"/>
+        <w:adjustRightInd w:val="0"/>
+        <w:spacing w:after="0" w:line="240" w:lineRule="auto"/>
+        <w:rPr>
+          <w:rFonts w:asciiTheme="majorHAnsi" w:hAnsiTheme="majorHAnsi" w:cs="CMSS10"/>
+          <w:color w:val="000000"/>
+        </w:rPr>
+      </w:pPr>
+      <w:r>
+        <w:rPr>
+          <w:rFonts w:asciiTheme="majorHAnsi" w:hAnsiTheme="majorHAnsi" w:cs="CMSS10"/>
+          <w:color w:val="000000"/>
+        </w:rPr>
+        <w:t>A plugin based server for hosting and contro</w:t>
+      </w:r>
+      <w:r>
+        <w:rPr>
+          <w:rFonts w:asciiTheme="majorHAnsi" w:hAnsiTheme="majorHAnsi" w:cs="CMSS10"/>
+          <w:color w:val="000000"/>
+        </w:rPr>
+        <w:t>lling multiplayer games for Set Top Boxes</w:t>
+      </w:r>
+      <w:r>
+        <w:rPr>
+          <w:rFonts w:asciiTheme="majorHAnsi" w:hAnsiTheme="majorHAnsi" w:cs="CMSS10"/>
+          <w:color w:val="000000"/>
+        </w:rPr>
+        <w:t xml:space="preserve"> in an </w:t>
+      </w:r>
+      <w:proofErr w:type="spellStart"/>
+      <w:r>
+        <w:rPr>
+          <w:rFonts w:asciiTheme="majorHAnsi" w:hAnsiTheme="majorHAnsi" w:cs="CMSS10"/>
+          <w:color w:val="000000"/>
+        </w:rPr>
+        <w:t>APMax</w:t>
+      </w:r>
+      <w:proofErr w:type="spellEnd"/>
+      <w:r>
+        <w:rPr>
+          <w:rFonts w:asciiTheme="majorHAnsi" w:hAnsiTheme="majorHAnsi" w:cs="CMSS10"/>
+          <w:color w:val="000000"/>
+        </w:rPr>
+        <w:t xml:space="preserve"> environment.</w:t>
+      </w:r>
+    </w:p>
+    <w:p>
+      <w:pPr>
+        <w:autoSpaceDE w:val="0"/>
+        <w:autoSpaceDN w:val="0"/>
+        <w:adjustRightInd w:val="0"/>
+        <w:spacing w:after="0" w:line="240" w:lineRule="auto"/>
+        <w:rPr>
+          <w:rFonts w:asciiTheme="majorHAnsi" w:hAnsiTheme="majorHAnsi" w:cs="CMSS10"/>
+          <w:color w:val="000000"/>
+        </w:rPr>
+      </w:pPr>
+    </w:p>
+    <w:p>
+      <w:pPr>
+        <w:pStyle w:val="Heading2"/>
+        <w:spacing w:before="0"/>
+      </w:pPr>
+      <w:r>
         <w:t>Key Business Goals:</w:t>
       </w:r>
     </w:p>
@@ -113,141 +637,64 @@
         <w:pStyle w:val="ListParagraph"/>
         <w:numPr>
           <w:ilvl w:val="0"/>
-          <w:numId w:val="1"/>
+          <w:numId w:val="7"/>
         </w:numPr>
         <w:autoSpaceDE w:val="0"/>
         <w:autoSpaceDN w:val="0"/>
         <w:adjustRightInd w:val="0"/>
         <w:spacing w:after="0" w:line="240" w:lineRule="auto"/>
         <w:rPr>
-          <w:rFonts w:ascii="CMSS10" w:hAnsi="CMSS10" w:cs="CMSS10"/>
-          <w:color w:val="000000"/>
-        </w:rPr>
-      </w:pPr>
-      <w:r>
-        <w:rPr>
-          <w:rFonts w:ascii="CMSS10" w:hAnsi="CMSS10" w:cs="CMSS10"/>
+          <w:rFonts w:asciiTheme="majorHAnsi" w:hAnsiTheme="majorHAnsi" w:cs="CMSS10"/>
+          <w:color w:val="000000"/>
+        </w:rPr>
+      </w:pPr>
+      <w:r>
+        <w:rPr>
+          <w:rFonts w:asciiTheme="majorHAnsi" w:hAnsiTheme="majorHAnsi" w:cs="CMSS10"/>
           <w:color w:val="000000"/>
         </w:rPr>
         <w:t>Keep c</w:t>
       </w:r>
       <w:r>
         <w:rPr>
-          <w:rFonts w:ascii="CMSS10" w:hAnsi="CMSS10" w:cs="CMSS10"/>
+          <w:rFonts w:asciiTheme="majorHAnsi" w:hAnsiTheme="majorHAnsi" w:cs="CMSS10"/>
           <w:color w:val="000000"/>
         </w:rPr>
         <w:t>onsumers</w:t>
       </w:r>
       <w:r>
         <w:rPr>
-          <w:rFonts w:ascii="CMSS10" w:hAnsi="CMSS10" w:cs="CMSS10"/>
+          <w:rFonts w:asciiTheme="majorHAnsi" w:hAnsiTheme="majorHAnsi" w:cs="CMSS10"/>
           <w:color w:val="000000"/>
         </w:rPr>
         <w:t xml:space="preserve"> interested in IPTV technology</w:t>
       </w:r>
-    </w:p>
-    <w:p>
-      <w:pPr>
-        <w:autoSpaceDE w:val="0"/>
-        <w:autoSpaceDN w:val="0"/>
-        <w:adjustRightInd w:val="0"/>
-        <w:spacing w:after="0" w:line="240" w:lineRule="auto"/>
-        <w:rPr>
-          <w:rFonts w:ascii="MSAM10" w:hAnsi="MSAM10" w:cs="MSAM10"/>
-          <w:color w:val="333367"/>
-          <w:sz w:val="16"/>
-          <w:szCs w:val="16"/>
-        </w:rPr>
-      </w:pPr>
-    </w:p>
-    <w:p>
-      <w:pPr>
-        <w:autoSpaceDE w:val="0"/>
-        <w:autoSpaceDN w:val="0"/>
-        <w:adjustRightInd w:val="0"/>
-        <w:spacing w:after="0" w:line="240" w:lineRule="auto"/>
-        <w:rPr>
-          <w:rFonts w:ascii="CMSS10" w:hAnsi="CMSS10" w:cs="CMSS10"/>
-          <w:color w:val="000000"/>
-        </w:rPr>
-      </w:pPr>
-      <w:r>
-        <w:rPr>
-          <w:rFonts w:ascii="CMSSBX10" w:hAnsi="CMSSBX10" w:cs="CMSSBX10"/>
-          <w:b/>
-          <w:color w:val="000000"/>
+      <w:bookmarkStart w:id="0" w:name="_GoBack"/>
+      <w:bookmarkEnd w:id="0"/>
+    </w:p>
+    <w:p>
+      <w:pPr>
+        <w:autoSpaceDE w:val="0"/>
+        <w:autoSpaceDN w:val="0"/>
+        <w:adjustRightInd w:val="0"/>
+        <w:spacing w:after="0" w:line="240" w:lineRule="auto"/>
+        <w:rPr>
+          <w:rFonts w:asciiTheme="majorHAnsi" w:hAnsiTheme="majorHAnsi" w:cs="CMSSBX10"/>
+          <w:color w:val="000000"/>
+        </w:rPr>
+      </w:pPr>
+      <w:r>
+        <w:rPr>
+          <w:rStyle w:val="Heading2Char"/>
         </w:rPr>
         <w:t>Primary Market:</w:t>
       </w:r>
       <w:r>
         <w:rPr>
-          <w:rFonts w:ascii="CMSSBX10" w:hAnsi="CMSSBX10" w:cs="CMSSBX10"/>
+          <w:rFonts w:asciiTheme="majorHAnsi" w:hAnsiTheme="majorHAnsi" w:cs="CMSSBX10"/>
           <w:color w:val="000000"/>
         </w:rPr>
         <w:t xml:space="preserve"> </w:t>
-      </w:r>
-      <w:r>
-        <w:rPr>
-          <w:rFonts w:ascii="CMSS10" w:hAnsi="CMSS10" w:cs="CMSS10"/>
-          <w:color w:val="000000"/>
-        </w:rPr>
-        <w:t>Consumers</w:t>
-      </w:r>
-    </w:p>
-    <w:p>
-      <w:pPr>
-        <w:autoSpaceDE w:val="0"/>
-        <w:autoSpaceDN w:val="0"/>
-        <w:adjustRightInd w:val="0"/>
-        <w:spacing w:after="0" w:line="240" w:lineRule="auto"/>
-        <w:rPr>
-          <w:rFonts w:ascii="CMSS10" w:hAnsi="CMSS10" w:cs="CMSS10"/>
-          <w:b/>
-          <w:color w:val="000000"/>
-        </w:rPr>
-      </w:pPr>
-      <w:r>
-        <w:rPr>
-          <w:rFonts w:ascii="CMSSBX10" w:hAnsi="CMSSBX10" w:cs="CMSSBX10"/>
-          <w:b/>
-          <w:color w:val="000000"/>
-        </w:rPr>
-        <w:t>Secondary Markets:</w:t>
-      </w:r>
-      <w:r>
-        <w:rPr>
-          <w:rFonts w:ascii="CMSSBX10" w:hAnsi="CMSSBX10" w:cs="CMSSBX10"/>
-          <w:color w:val="000000"/>
-        </w:rPr>
-        <w:t xml:space="preserve"> </w:t>
-      </w:r>
-      <w:r>
-        <w:rPr>
-          <w:rFonts w:ascii="CMSS10" w:hAnsi="CMSS10" w:cs="CMSS10"/>
-          <w:color w:val="000000"/>
-        </w:rPr>
-        <w:t>Telephone Companies</w:t>
-      </w:r>
-    </w:p>
-    <w:p>
-      <w:pPr>
-        <w:autoSpaceDE w:val="0"/>
-        <w:autoSpaceDN w:val="0"/>
-        <w:adjustRightInd w:val="0"/>
-        <w:spacing w:after="0" w:line="240" w:lineRule="auto"/>
-        <w:rPr>
-          <w:rFonts w:ascii="CMSSBX10" w:hAnsi="CMSSBX10" w:cs="CMSSBX10"/>
-          <w:b/>
-          <w:color w:val="000000"/>
-        </w:rPr>
-      </w:pPr>
-      <w:r>
-        <w:rPr>
-          <w:rFonts w:ascii="CMSSBX10" w:hAnsi="CMSSBX10" w:cs="CMSSBX10"/>
-          <w:b/>
-          <w:color w:val="000000"/>
-        </w:rPr>
-        <w:t>Assumptions:</w:t>
       </w:r>
     </w:p>
     <w:p>
@@ -255,24 +702,48 @@
         <w:pStyle w:val="ListParagraph"/>
         <w:numPr>
           <w:ilvl w:val="0"/>
-          <w:numId w:val="1"/>
+          <w:numId w:val="7"/>
         </w:numPr>
         <w:autoSpaceDE w:val="0"/>
         <w:autoSpaceDN w:val="0"/>
         <w:adjustRightInd w:val="0"/>
         <w:spacing w:after="0" w:line="240" w:lineRule="auto"/>
         <w:rPr>
-          <w:rFonts w:ascii="CMSSBX10" w:hAnsi="CMSSBX10" w:cs="CMSSBX10"/>
-          <w:b/>
-          <w:color w:val="000000"/>
-        </w:rPr>
-      </w:pPr>
-      <w:r>
-        <w:rPr>
-          <w:rFonts w:ascii="CMSSBX10" w:hAnsi="CMSSBX10" w:cs="CMSSBX10"/>
-          <w:color w:val="000000"/>
-        </w:rPr>
-        <w:t>Single server</w:t>
+          <w:rFonts w:asciiTheme="majorHAnsi" w:hAnsiTheme="majorHAnsi" w:cs="CMSS10"/>
+          <w:color w:val="000000"/>
+        </w:rPr>
+      </w:pPr>
+      <w:r>
+        <w:rPr>
+          <w:rFonts w:asciiTheme="majorHAnsi" w:hAnsiTheme="majorHAnsi" w:cs="CMSS10"/>
+          <w:color w:val="000000"/>
+        </w:rPr>
+        <w:t>Consumers</w:t>
+      </w:r>
+    </w:p>
+    <w:p>
+      <w:pPr>
+        <w:autoSpaceDE w:val="0"/>
+        <w:autoSpaceDN w:val="0"/>
+        <w:adjustRightInd w:val="0"/>
+        <w:spacing w:after="0" w:line="240" w:lineRule="auto"/>
+        <w:rPr>
+          <w:rFonts w:asciiTheme="majorHAnsi" w:hAnsiTheme="majorHAnsi" w:cs="CMSSBX10"/>
+          <w:color w:val="000000"/>
+        </w:rPr>
+      </w:pPr>
+      <w:r>
+        <w:rPr>
+          <w:rStyle w:val="Heading2Char"/>
+        </w:rPr>
+        <w:t>Secondary Markets:</w:t>
+      </w:r>
+      <w:r>
+        <w:rPr>
+          <w:rFonts w:asciiTheme="majorHAnsi" w:hAnsiTheme="majorHAnsi" w:cs="CMSSBX10"/>
+          <w:color w:val="000000"/>
+        </w:rPr>
+        <w:t xml:space="preserve"> </w:t>
       </w:r>
     </w:p>
     <w:p>
@@ -280,45 +751,58 @@
         <w:pStyle w:val="ListParagraph"/>
         <w:numPr>
           <w:ilvl w:val="0"/>
-          <w:numId w:val="1"/>
+          <w:numId w:val="7"/>
         </w:numPr>
         <w:autoSpaceDE w:val="0"/>
         <w:autoSpaceDN w:val="0"/>
         <w:adjustRightInd w:val="0"/>
         <w:spacing w:after="0" w:line="240" w:lineRule="auto"/>
         <w:rPr>
-          <w:rFonts w:ascii="CMSSBX10" w:hAnsi="CMSSBX10" w:cs="CMSSBX10"/>
+          <w:rFonts w:asciiTheme="majorHAnsi" w:hAnsiTheme="majorHAnsi" w:cs="CMSS10"/>
           <w:b/>
           <w:color w:val="000000"/>
         </w:rPr>
       </w:pPr>
       <w:r>
         <w:rPr>
-          <w:rFonts w:ascii="CMSSBX10" w:hAnsi="CMSSBX10" w:cs="CMSSBX10"/>
-          <w:color w:val="000000"/>
-        </w:rPr>
-        <w:t>Support 100</w:t>
-      </w:r>
-      <w:r>
-        <w:rPr>
-          <w:rFonts w:ascii="CMSSBX10" w:hAnsi="CMSSBX10" w:cs="CMSSBX10"/>
-          <w:color w:val="000000"/>
-        </w:rPr>
-        <w:t>–</w:t>
-      </w:r>
-      <w:r>
-        <w:rPr>
-          <w:rFonts w:ascii="CMSSBX10" w:hAnsi="CMSSBX10" w:cs="CMSSBX10"/>
-          <w:color w:val="000000"/>
-        </w:rPr>
-        <w:t>1</w:t>
-      </w:r>
-      <w:r>
-        <w:rPr>
-          <w:rFonts w:ascii="CMSSBX10" w:hAnsi="CMSSBX10" w:cs="CMSSBX10"/>
-          <w:color w:val="000000"/>
-        </w:rPr>
-        <w:t>000 users</w:t>
+          <w:rFonts w:asciiTheme="majorHAnsi" w:hAnsiTheme="majorHAnsi" w:cs="CMSS10"/>
+          <w:color w:val="000000"/>
+        </w:rPr>
+        <w:t>Telephone Companies</w:t>
+      </w:r>
+    </w:p>
+    <w:p>
+      <w:pPr>
+        <w:pStyle w:val="Heading2"/>
+        <w:spacing w:before="0"/>
+      </w:pPr>
+      <w:r>
+        <w:t>Assumptions:</w:t>
+      </w:r>
+    </w:p>
+    <w:p>
+      <w:pPr>
+        <w:pStyle w:val="Heading2"/>
+        <w:numPr>
+          <w:ilvl w:val="0"/>
+          <w:numId w:val="7"/>
+        </w:numPr>
+        <w:spacing w:before="0"/>
+        <w:rPr>
+          <w:b w:val="0"/>
+          <w:sz w:val="22"/>
+          <w:szCs w:val="22"/>
+        </w:rPr>
+      </w:pPr>
+      <w:r>
+        <w:rPr>
+          <w:rFonts w:cs="CMSSBX10"/>
+          <w:b w:val="0"/>
+          <w:color w:val="000000"/>
+          <w:sz w:val="22"/>
+          <w:szCs w:val="22"/>
+        </w:rPr>
+        <w:t>Single server</w:t>
       </w:r>
     </w:p>
     <w:p>
@@ -326,68 +810,45 @@
         <w:pStyle w:val="ListParagraph"/>
         <w:numPr>
           <w:ilvl w:val="0"/>
-          <w:numId w:val="1"/>
+          <w:numId w:val="7"/>
         </w:numPr>
         <w:autoSpaceDE w:val="0"/>
         <w:autoSpaceDN w:val="0"/>
         <w:adjustRightInd w:val="0"/>
         <w:spacing w:after="0" w:line="240" w:lineRule="auto"/>
         <w:rPr>
-          <w:rFonts w:ascii="CMSSBX10" w:hAnsi="CMSSBX10" w:cs="CMSSBX10"/>
+          <w:rFonts w:asciiTheme="majorHAnsi" w:hAnsiTheme="majorHAnsi" w:cs="CMSSBX10"/>
           <w:b/>
           <w:color w:val="000000"/>
         </w:rPr>
       </w:pPr>
       <w:r>
         <w:rPr>
-          <w:rFonts w:ascii="CMSSBX10" w:hAnsi="CMSSBX10" w:cs="CMSSBX10"/>
-          <w:color w:val="000000"/>
-        </w:rPr>
-        <w:t>Windows</w:t>
-      </w:r>
-      <w:r>
-        <w:rPr>
-          <w:rFonts w:ascii="CMSSBX10" w:hAnsi="CMSSBX10" w:cs="CMSSBX10"/>
-          <w:color w:val="000000"/>
-        </w:rPr>
-        <w:t xml:space="preserve"> server</w:t>
-      </w:r>
-      <w:r>
-        <w:rPr>
-          <w:rFonts w:ascii="CMSSBX10" w:hAnsi="CMSSBX10" w:cs="CMSSBX10"/>
-          <w:color w:val="000000"/>
-        </w:rPr>
-        <w:t xml:space="preserve"> e</w:t>
-      </w:r>
-      <w:r>
-        <w:rPr>
-          <w:rFonts w:ascii="CMSSBX10" w:hAnsi="CMSSBX10" w:cs="CMSSBX10"/>
-          <w:color w:val="000000"/>
-        </w:rPr>
-        <w:t>nvironment</w:t>
-      </w:r>
-    </w:p>
-    <w:p>
-      <w:pPr>
-        <w:pStyle w:val="ListParagraph"/>
-        <w:autoSpaceDE w:val="0"/>
-        <w:autoSpaceDN w:val="0"/>
-        <w:adjustRightInd w:val="0"/>
-        <w:spacing w:after="0" w:line="240" w:lineRule="auto"/>
-        <w:ind w:left="0"/>
-        <w:rPr>
-          <w:rFonts w:ascii="CMSSBX10" w:hAnsi="CMSSBX10" w:cs="CMSSBX10"/>
-          <w:b/>
-          <w:color w:val="000000"/>
-        </w:rPr>
-      </w:pPr>
-      <w:r>
-        <w:rPr>
-          <w:rFonts w:ascii="CMSSBX10" w:hAnsi="CMSSBX10" w:cs="CMSSBX10"/>
-          <w:b/>
-          <w:color w:val="000000"/>
-        </w:rPr>
-        <w:t>Stakeholders:</w:t>
+          <w:rFonts w:asciiTheme="majorHAnsi" w:hAnsiTheme="majorHAnsi" w:cs="CMSSBX10"/>
+          <w:color w:val="000000"/>
+        </w:rPr>
+        <w:t>Support 100</w:t>
+      </w:r>
+      <w:r>
+        <w:rPr>
+          <w:rFonts w:asciiTheme="majorHAnsi" w:hAnsiTheme="majorHAnsi" w:cs="CMSSBX10"/>
+          <w:color w:val="000000"/>
+        </w:rPr>
+        <w:t>–</w:t>
+      </w:r>
+      <w:r>
+        <w:rPr>
+          <w:rFonts w:asciiTheme="majorHAnsi" w:hAnsiTheme="majorHAnsi" w:cs="CMSSBX10"/>
+          <w:color w:val="000000"/>
+        </w:rPr>
+        <w:t>1</w:t>
+      </w:r>
+      <w:r>
+        <w:rPr>
+          <w:rFonts w:asciiTheme="majorHAnsi" w:hAnsiTheme="majorHAnsi" w:cs="CMSSBX10"/>
+          <w:color w:val="000000"/>
+        </w:rPr>
+        <w:t>000 users</w:t>
       </w:r>
     </w:p>
     <w:p>
@@ -395,24 +856,54 @@
         <w:pStyle w:val="ListParagraph"/>
         <w:numPr>
           <w:ilvl w:val="0"/>
-          <w:numId w:val="2"/>
+          <w:numId w:val="7"/>
         </w:numPr>
         <w:autoSpaceDE w:val="0"/>
         <w:autoSpaceDN w:val="0"/>
         <w:adjustRightInd w:val="0"/>
         <w:spacing w:after="0" w:line="240" w:lineRule="auto"/>
         <w:rPr>
-          <w:rFonts w:ascii="CMSSBX10" w:hAnsi="CMSSBX10" w:cs="CMSSBX10"/>
+          <w:rFonts w:asciiTheme="majorHAnsi" w:hAnsiTheme="majorHAnsi" w:cs="CMSSBX10"/>
           <w:b/>
           <w:color w:val="000000"/>
         </w:rPr>
       </w:pPr>
       <w:r>
         <w:rPr>
-          <w:rFonts w:ascii="CMSSBX10" w:hAnsi="CMSSBX10" w:cs="CMSSBX10"/>
-          <w:color w:val="000000"/>
-        </w:rPr>
-        <w:t>Consumers</w:t>
+          <w:rFonts w:asciiTheme="majorHAnsi" w:hAnsiTheme="majorHAnsi" w:cs="CMSSBX10"/>
+          <w:color w:val="000000"/>
+        </w:rPr>
+        <w:t>Windows</w:t>
+      </w:r>
+      <w:r>
+        <w:rPr>
+          <w:rFonts w:asciiTheme="majorHAnsi" w:hAnsiTheme="majorHAnsi" w:cs="CMSSBX10"/>
+          <w:color w:val="000000"/>
+        </w:rPr>
+        <w:t xml:space="preserve"> server</w:t>
+      </w:r>
+      <w:r>
+        <w:rPr>
+          <w:rFonts w:asciiTheme="majorHAnsi" w:hAnsiTheme="majorHAnsi" w:cs="CMSSBX10"/>
+          <w:color w:val="000000"/>
+        </w:rPr>
+        <w:t xml:space="preserve"> e</w:t>
+      </w:r>
+      <w:r>
+        <w:rPr>
+          <w:rFonts w:asciiTheme="majorHAnsi" w:hAnsiTheme="majorHAnsi" w:cs="CMSSBX10"/>
+          <w:color w:val="000000"/>
+        </w:rPr>
+        <w:t>nvironment</w:t>
+      </w:r>
+    </w:p>
+    <w:p>
+      <w:pPr>
+        <w:pStyle w:val="Heading2"/>
+        <w:spacing w:before="0"/>
+      </w:pPr>
+      <w:r>
+        <w:t>Stakeholders:</w:t>
       </w:r>
     </w:p>
     <w:p>
@@ -420,24 +911,24 @@
         <w:pStyle w:val="ListParagraph"/>
         <w:numPr>
           <w:ilvl w:val="0"/>
-          <w:numId w:val="2"/>
+          <w:numId w:val="8"/>
         </w:numPr>
         <w:autoSpaceDE w:val="0"/>
         <w:autoSpaceDN w:val="0"/>
         <w:adjustRightInd w:val="0"/>
         <w:spacing w:after="0" w:line="240" w:lineRule="auto"/>
         <w:rPr>
-          <w:rFonts w:ascii="CMSSBX10" w:hAnsi="CMSSBX10" w:cs="CMSSBX10"/>
+          <w:rFonts w:asciiTheme="majorHAnsi" w:hAnsiTheme="majorHAnsi" w:cs="CMSSBX10"/>
           <w:b/>
           <w:color w:val="000000"/>
         </w:rPr>
       </w:pPr>
       <w:r>
         <w:rPr>
-          <w:rFonts w:ascii="CMSSBX10" w:hAnsi="CMSSBX10" w:cs="CMSSBX10"/>
-          <w:color w:val="000000"/>
-        </w:rPr>
-        <w:t>Telephone Companies</w:t>
+          <w:rFonts w:asciiTheme="majorHAnsi" w:hAnsiTheme="majorHAnsi" w:cs="CMSSBX10"/>
+          <w:color w:val="000000"/>
+        </w:rPr>
+        <w:t>Consumers</w:t>
       </w:r>
     </w:p>
     <w:p>
@@ -445,24 +936,24 @@
         <w:pStyle w:val="ListParagraph"/>
         <w:numPr>
           <w:ilvl w:val="0"/>
-          <w:numId w:val="2"/>
+          <w:numId w:val="8"/>
         </w:numPr>
         <w:autoSpaceDE w:val="0"/>
         <w:autoSpaceDN w:val="0"/>
         <w:adjustRightInd w:val="0"/>
         <w:spacing w:after="0" w:line="240" w:lineRule="auto"/>
         <w:rPr>
-          <w:rFonts w:ascii="CMSSBX10" w:hAnsi="CMSSBX10" w:cs="CMSSBX10"/>
+          <w:rFonts w:asciiTheme="majorHAnsi" w:hAnsiTheme="majorHAnsi" w:cs="CMSSBX10"/>
           <w:b/>
           <w:color w:val="000000"/>
         </w:rPr>
       </w:pPr>
       <w:r>
         <w:rPr>
-          <w:rFonts w:ascii="CMSSBX10" w:hAnsi="CMSSBX10" w:cs="CMSSBX10"/>
-          <w:color w:val="000000"/>
-        </w:rPr>
-        <w:t>Sales Team</w:t>
+          <w:rFonts w:asciiTheme="majorHAnsi" w:hAnsiTheme="majorHAnsi" w:cs="CMSSBX10"/>
+          <w:color w:val="000000"/>
+        </w:rPr>
+        <w:t>Telephone Companies</w:t>
       </w:r>
     </w:p>
     <w:p>
@@ -470,21 +961,46 @@
         <w:pStyle w:val="ListParagraph"/>
         <w:numPr>
           <w:ilvl w:val="0"/>
-          <w:numId w:val="2"/>
+          <w:numId w:val="8"/>
         </w:numPr>
         <w:autoSpaceDE w:val="0"/>
         <w:autoSpaceDN w:val="0"/>
         <w:adjustRightInd w:val="0"/>
         <w:spacing w:after="0" w:line="240" w:lineRule="auto"/>
         <w:rPr>
-          <w:rFonts w:ascii="CMSSBX10" w:hAnsi="CMSSBX10" w:cs="CMSSBX10"/>
+          <w:rFonts w:asciiTheme="majorHAnsi" w:hAnsiTheme="majorHAnsi" w:cs="CMSSBX10"/>
           <w:b/>
           <w:color w:val="000000"/>
         </w:rPr>
       </w:pPr>
       <w:r>
         <w:rPr>
-          <w:rFonts w:ascii="CMSSBX10" w:hAnsi="CMSSBX10" w:cs="CMSSBX10"/>
+          <w:rFonts w:asciiTheme="majorHAnsi" w:hAnsiTheme="majorHAnsi" w:cs="CMSSBX10"/>
+          <w:color w:val="000000"/>
+        </w:rPr>
+        <w:t>Sales Team</w:t>
+      </w:r>
+    </w:p>
+    <w:p>
+      <w:pPr>
+        <w:pStyle w:val="ListParagraph"/>
+        <w:numPr>
+          <w:ilvl w:val="0"/>
+          <w:numId w:val="8"/>
+        </w:numPr>
+        <w:autoSpaceDE w:val="0"/>
+        <w:autoSpaceDN w:val="0"/>
+        <w:adjustRightInd w:val="0"/>
+        <w:spacing w:after="0" w:line="240" w:lineRule="auto"/>
+        <w:rPr>
+          <w:rFonts w:asciiTheme="majorHAnsi" w:hAnsiTheme="majorHAnsi" w:cs="CMSSBX10"/>
+          <w:b/>
+          <w:color w:val="000000"/>
+        </w:rPr>
+      </w:pPr>
+      <w:r>
+        <w:rPr>
+          <w:rFonts w:asciiTheme="majorHAnsi" w:hAnsiTheme="majorHAnsi" w:cs="CMSSBX10"/>
           <w:color w:val="000000"/>
         </w:rPr>
         <w:t>Management</w:t>
@@ -492,24 +1008,9 @@
     </w:p>
     <w:p>
       <w:pPr>
-        <w:pStyle w:val="ListParagraph"/>
-        <w:autoSpaceDE w:val="0"/>
-        <w:autoSpaceDN w:val="0"/>
-        <w:adjustRightInd w:val="0"/>
-        <w:spacing w:after="0" w:line="240" w:lineRule="auto"/>
-        <w:ind w:hanging="720"/>
-        <w:rPr>
-          <w:rFonts w:ascii="CMSSBX10" w:hAnsi="CMSSBX10" w:cs="CMSSBX10"/>
-          <w:b/>
-          <w:color w:val="000000"/>
-        </w:rPr>
-      </w:pPr>
-      <w:r>
-        <w:rPr>
-          <w:rFonts w:ascii="CMSSBX10" w:hAnsi="CMSSBX10" w:cs="CMSSBX10"/>
-          <w:b/>
-          <w:color w:val="000000"/>
-        </w:rPr>
+        <w:pStyle w:val="Heading2"/>
+      </w:pPr>
+      <w:r>
         <w:t>Certifications:</w:t>
       </w:r>
     </w:p>
@@ -639,6 +1140,573 @@
     </w:lvl>
   </w:abstractNum>
   <w:abstractNum w:abstractNumId="1">
+    <w:nsid w:val="3088117D"/>
+    <w:multiLevelType w:val="hybridMultilevel"/>
+    <w:tmpl w:val="532AF22A"/>
+    <w:lvl w:ilvl="0" w:tplc="D57EF8A0">
+      <w:start w:val="1"/>
+      <w:numFmt w:val="bullet"/>
+      <w:lvlText w:val=""/>
+      <w:lvlJc w:val="left"/>
+      <w:pPr>
+        <w:ind w:left="720" w:hanging="360"/>
+      </w:pPr>
+      <w:rPr>
+        <w:rFonts w:ascii="Symbol" w:hAnsi="Symbol" w:hint="default"/>
+        <w:color w:val="auto"/>
+      </w:rPr>
+    </w:lvl>
+    <w:lvl w:ilvl="1" w:tplc="04090003" w:tentative="1">
+      <w:start w:val="1"/>
+      <w:numFmt w:val="bullet"/>
+      <w:lvlText w:val="o"/>
+      <w:lvlJc w:val="left"/>
+      <w:pPr>
+        <w:ind w:left="1440" w:hanging="360"/>
+      </w:pPr>
+      <w:rPr>
+        <w:rFonts w:ascii="Courier New" w:hAnsi="Courier New" w:cs="Courier New" w:hint="default"/>
+      </w:rPr>
+    </w:lvl>
+    <w:lvl w:ilvl="2" w:tplc="04090005" w:tentative="1">
+      <w:start w:val="1"/>
+      <w:numFmt w:val="bullet"/>
+      <w:lvlText w:val=""/>
+      <w:lvlJc w:val="left"/>
+      <w:pPr>
+        <w:ind w:left="2160" w:hanging="360"/>
+      </w:pPr>
+      <w:rPr>
+        <w:rFonts w:ascii="Wingdings" w:hAnsi="Wingdings" w:hint="default"/>
+      </w:rPr>
+    </w:lvl>
+    <w:lvl w:ilvl="3" w:tplc="04090001" w:tentative="1">
+      <w:start w:val="1"/>
+      <w:numFmt w:val="bullet"/>
+      <w:lvlText w:val=""/>
+      <w:lvlJc w:val="left"/>
+      <w:pPr>
+        <w:ind w:left="2880" w:hanging="360"/>
+      </w:pPr>
+      <w:rPr>
+        <w:rFonts w:ascii="Symbol" w:hAnsi="Symbol" w:hint="default"/>
+      </w:rPr>
+    </w:lvl>
+    <w:lvl w:ilvl="4" w:tplc="04090003" w:tentative="1">
+      <w:start w:val="1"/>
+      <w:numFmt w:val="bullet"/>
+      <w:lvlText w:val="o"/>
+      <w:lvlJc w:val="left"/>
+      <w:pPr>
+        <w:ind w:left="3600" w:hanging="360"/>
+      </w:pPr>
+      <w:rPr>
+        <w:rFonts w:ascii="Courier New" w:hAnsi="Courier New" w:cs="Courier New" w:hint="default"/>
+      </w:rPr>
+    </w:lvl>
+    <w:lvl w:ilvl="5" w:tplc="04090005" w:tentative="1">
+      <w:start w:val="1"/>
+      <w:numFmt w:val="bullet"/>
+      <w:lvlText w:val=""/>
+      <w:lvlJc w:val="left"/>
+      <w:pPr>
+        <w:ind w:left="4320" w:hanging="360"/>
+      </w:pPr>
+      <w:rPr>
+        <w:rFonts w:ascii="Wingdings" w:hAnsi="Wingdings" w:hint="default"/>
+      </w:rPr>
+    </w:lvl>
+    <w:lvl w:ilvl="6" w:tplc="04090001" w:tentative="1">
+      <w:start w:val="1"/>
+      <w:numFmt w:val="bullet"/>
+      <w:lvlText w:val=""/>
+      <w:lvlJc w:val="left"/>
+      <w:pPr>
+        <w:ind w:left="5040" w:hanging="360"/>
+      </w:pPr>
+      <w:rPr>
+        <w:rFonts w:ascii="Symbol" w:hAnsi="Symbol" w:hint="default"/>
+      </w:rPr>
+    </w:lvl>
+    <w:lvl w:ilvl="7" w:tplc="04090003" w:tentative="1">
+      <w:start w:val="1"/>
+      <w:numFmt w:val="bullet"/>
+      <w:lvlText w:val="o"/>
+      <w:lvlJc w:val="left"/>
+      <w:pPr>
+        <w:ind w:left="5760" w:hanging="360"/>
+      </w:pPr>
+      <w:rPr>
+        <w:rFonts w:ascii="Courier New" w:hAnsi="Courier New" w:cs="Courier New" w:hint="default"/>
+      </w:rPr>
+    </w:lvl>
+    <w:lvl w:ilvl="8" w:tplc="04090005" w:tentative="1">
+      <w:start w:val="1"/>
+      <w:numFmt w:val="bullet"/>
+      <w:lvlText w:val=""/>
+      <w:lvlJc w:val="left"/>
+      <w:pPr>
+        <w:ind w:left="6480" w:hanging="360"/>
+      </w:pPr>
+      <w:rPr>
+        <w:rFonts w:ascii="Wingdings" w:hAnsi="Wingdings" w:hint="default"/>
+      </w:rPr>
+    </w:lvl>
+  </w:abstractNum>
+  <w:abstractNum w:abstractNumId="2">
+    <w:nsid w:val="3A8D7237"/>
+    <w:multiLevelType w:val="hybridMultilevel"/>
+    <w:tmpl w:val="E12282D6"/>
+    <w:lvl w:ilvl="0" w:tplc="04090001">
+      <w:start w:val="1"/>
+      <w:numFmt w:val="bullet"/>
+      <w:lvlText w:val=""/>
+      <w:lvlJc w:val="left"/>
+      <w:pPr>
+        <w:ind w:left="2880" w:hanging="360"/>
+      </w:pPr>
+      <w:rPr>
+        <w:rFonts w:ascii="Symbol" w:hAnsi="Symbol" w:hint="default"/>
+      </w:rPr>
+    </w:lvl>
+    <w:lvl w:ilvl="1" w:tplc="04090003" w:tentative="1">
+      <w:start w:val="1"/>
+      <w:numFmt w:val="bullet"/>
+      <w:lvlText w:val="o"/>
+      <w:lvlJc w:val="left"/>
+      <w:pPr>
+        <w:ind w:left="3600" w:hanging="360"/>
+      </w:pPr>
+      <w:rPr>
+        <w:rFonts w:ascii="Courier New" w:hAnsi="Courier New" w:cs="Courier New" w:hint="default"/>
+      </w:rPr>
+    </w:lvl>
+    <w:lvl w:ilvl="2" w:tplc="04090005" w:tentative="1">
+      <w:start w:val="1"/>
+      <w:numFmt w:val="bullet"/>
+      <w:lvlText w:val=""/>
+      <w:lvlJc w:val="left"/>
+      <w:pPr>
+        <w:ind w:left="4320" w:hanging="360"/>
+      </w:pPr>
+      <w:rPr>
+        <w:rFonts w:ascii="Wingdings" w:hAnsi="Wingdings" w:hint="default"/>
+      </w:rPr>
+    </w:lvl>
+    <w:lvl w:ilvl="3" w:tplc="04090001" w:tentative="1">
+      <w:start w:val="1"/>
+      <w:numFmt w:val="bullet"/>
+      <w:lvlText w:val=""/>
+      <w:lvlJc w:val="left"/>
+      <w:pPr>
+        <w:ind w:left="5040" w:hanging="360"/>
+      </w:pPr>
+      <w:rPr>
+        <w:rFonts w:ascii="Symbol" w:hAnsi="Symbol" w:hint="default"/>
+      </w:rPr>
+    </w:lvl>
+    <w:lvl w:ilvl="4" w:tplc="04090003" w:tentative="1">
+      <w:start w:val="1"/>
+      <w:numFmt w:val="bullet"/>
+      <w:lvlText w:val="o"/>
+      <w:lvlJc w:val="left"/>
+      <w:pPr>
+        <w:ind w:left="5760" w:hanging="360"/>
+      </w:pPr>
+      <w:rPr>
+        <w:rFonts w:ascii="Courier New" w:hAnsi="Courier New" w:cs="Courier New" w:hint="default"/>
+      </w:rPr>
+    </w:lvl>
+    <w:lvl w:ilvl="5" w:tplc="04090005" w:tentative="1">
+      <w:start w:val="1"/>
+      <w:numFmt w:val="bullet"/>
+      <w:lvlText w:val=""/>
+      <w:lvlJc w:val="left"/>
+      <w:pPr>
+        <w:ind w:left="6480" w:hanging="360"/>
+      </w:pPr>
+      <w:rPr>
+        <w:rFonts w:ascii="Wingdings" w:hAnsi="Wingdings" w:hint="default"/>
+      </w:rPr>
+    </w:lvl>
+    <w:lvl w:ilvl="6" w:tplc="04090001" w:tentative="1">
+      <w:start w:val="1"/>
+      <w:numFmt w:val="bullet"/>
+      <w:lvlText w:val=""/>
+      <w:lvlJc w:val="left"/>
+      <w:pPr>
+        <w:ind w:left="7200" w:hanging="360"/>
+      </w:pPr>
+      <w:rPr>
+        <w:rFonts w:ascii="Symbol" w:hAnsi="Symbol" w:hint="default"/>
+      </w:rPr>
+    </w:lvl>
+    <w:lvl w:ilvl="7" w:tplc="04090003" w:tentative="1">
+      <w:start w:val="1"/>
+      <w:numFmt w:val="bullet"/>
+      <w:lvlText w:val="o"/>
+      <w:lvlJc w:val="left"/>
+      <w:pPr>
+        <w:ind w:left="7920" w:hanging="360"/>
+      </w:pPr>
+      <w:rPr>
+        <w:rFonts w:ascii="Courier New" w:hAnsi="Courier New" w:cs="Courier New" w:hint="default"/>
+      </w:rPr>
+    </w:lvl>
+    <w:lvl w:ilvl="8" w:tplc="04090005" w:tentative="1">
+      <w:start w:val="1"/>
+      <w:numFmt w:val="bullet"/>
+      <w:lvlText w:val=""/>
+      <w:lvlJc w:val="left"/>
+      <w:pPr>
+        <w:ind w:left="8640" w:hanging="360"/>
+      </w:pPr>
+      <w:rPr>
+        <w:rFonts w:ascii="Wingdings" w:hAnsi="Wingdings" w:hint="default"/>
+      </w:rPr>
+    </w:lvl>
+  </w:abstractNum>
+  <w:abstractNum w:abstractNumId="3">
+    <w:nsid w:val="4F327C00"/>
+    <w:multiLevelType w:val="hybridMultilevel"/>
+    <w:tmpl w:val="E304BC7A"/>
+    <w:lvl w:ilvl="0" w:tplc="04090001">
+      <w:start w:val="1"/>
+      <w:numFmt w:val="bullet"/>
+      <w:lvlText w:val=""/>
+      <w:lvlJc w:val="left"/>
+      <w:pPr>
+        <w:ind w:left="720" w:hanging="360"/>
+      </w:pPr>
+      <w:rPr>
+        <w:rFonts w:ascii="Symbol" w:hAnsi="Symbol" w:hint="default"/>
+      </w:rPr>
+    </w:lvl>
+    <w:lvl w:ilvl="1" w:tplc="04090003" w:tentative="1">
+      <w:start w:val="1"/>
+      <w:numFmt w:val="bullet"/>
+      <w:lvlText w:val="o"/>
+      <w:lvlJc w:val="left"/>
+      <w:pPr>
+        <w:ind w:left="1440" w:hanging="360"/>
+      </w:pPr>
+      <w:rPr>
+        <w:rFonts w:ascii="Courier New" w:hAnsi="Courier New" w:cs="Courier New" w:hint="default"/>
+      </w:rPr>
+    </w:lvl>
+    <w:lvl w:ilvl="2" w:tplc="04090005" w:tentative="1">
+      <w:start w:val="1"/>
+      <w:numFmt w:val="bullet"/>
+      <w:lvlText w:val=""/>
+      <w:lvlJc w:val="left"/>
+      <w:pPr>
+        <w:ind w:left="2160" w:hanging="360"/>
+      </w:pPr>
+      <w:rPr>
+        <w:rFonts w:ascii="Wingdings" w:hAnsi="Wingdings" w:hint="default"/>
+      </w:rPr>
+    </w:lvl>
+    <w:lvl w:ilvl="3" w:tplc="04090001" w:tentative="1">
+      <w:start w:val="1"/>
+      <w:numFmt w:val="bullet"/>
+      <w:lvlText w:val=""/>
+      <w:lvlJc w:val="left"/>
+      <w:pPr>
+        <w:ind w:left="2880" w:hanging="360"/>
+      </w:pPr>
+      <w:rPr>
+        <w:rFonts w:ascii="Symbol" w:hAnsi="Symbol" w:hint="default"/>
+      </w:rPr>
+    </w:lvl>
+    <w:lvl w:ilvl="4" w:tplc="04090003" w:tentative="1">
+      <w:start w:val="1"/>
+      <w:numFmt w:val="bullet"/>
+      <w:lvlText w:val="o"/>
+      <w:lvlJc w:val="left"/>
+      <w:pPr>
+        <w:ind w:left="3600" w:hanging="360"/>
+      </w:pPr>
+      <w:rPr>
+        <w:rFonts w:ascii="Courier New" w:hAnsi="Courier New" w:cs="Courier New" w:hint="default"/>
+      </w:rPr>
+    </w:lvl>
+    <w:lvl w:ilvl="5" w:tplc="04090005" w:tentative="1">
+      <w:start w:val="1"/>
+      <w:numFmt w:val="bullet"/>
+      <w:lvlText w:val=""/>
+      <w:lvlJc w:val="left"/>
+      <w:pPr>
+        <w:ind w:left="4320" w:hanging="360"/>
+      </w:pPr>
+      <w:rPr>
+        <w:rFonts w:ascii="Wingdings" w:hAnsi="Wingdings" w:hint="default"/>
+      </w:rPr>
+    </w:lvl>
+    <w:lvl w:ilvl="6" w:tplc="04090001" w:tentative="1">
+      <w:start w:val="1"/>
+      <w:numFmt w:val="bullet"/>
+      <w:lvlText w:val=""/>
+      <w:lvlJc w:val="left"/>
+      <w:pPr>
+        <w:ind w:left="5040" w:hanging="360"/>
+      </w:pPr>
+      <w:rPr>
+        <w:rFonts w:ascii="Symbol" w:hAnsi="Symbol" w:hint="default"/>
+      </w:rPr>
+    </w:lvl>
+    <w:lvl w:ilvl="7" w:tplc="04090003" w:tentative="1">
+      <w:start w:val="1"/>
+      <w:numFmt w:val="bullet"/>
+      <w:lvlText w:val="o"/>
+      <w:lvlJc w:val="left"/>
+      <w:pPr>
+        <w:ind w:left="5760" w:hanging="360"/>
+      </w:pPr>
+      <w:rPr>
+        <w:rFonts w:ascii="Courier New" w:hAnsi="Courier New" w:cs="Courier New" w:hint="default"/>
+      </w:rPr>
+    </w:lvl>
+    <w:lvl w:ilvl="8" w:tplc="04090005" w:tentative="1">
+      <w:start w:val="1"/>
+      <w:numFmt w:val="bullet"/>
+      <w:lvlText w:val=""/>
+      <w:lvlJc w:val="left"/>
+      <w:pPr>
+        <w:ind w:left="6480" w:hanging="360"/>
+      </w:pPr>
+      <w:rPr>
+        <w:rFonts w:ascii="Wingdings" w:hAnsi="Wingdings" w:hint="default"/>
+      </w:rPr>
+    </w:lvl>
+  </w:abstractNum>
+  <w:abstractNum w:abstractNumId="4">
+    <w:nsid w:val="514A4943"/>
+    <w:multiLevelType w:val="hybridMultilevel"/>
+    <w:tmpl w:val="27C41350"/>
+    <w:lvl w:ilvl="0" w:tplc="D57EF8A0">
+      <w:start w:val="1"/>
+      <w:numFmt w:val="bullet"/>
+      <w:lvlText w:val=""/>
+      <w:lvlJc w:val="left"/>
+      <w:pPr>
+        <w:ind w:left="720" w:hanging="360"/>
+      </w:pPr>
+      <w:rPr>
+        <w:rFonts w:ascii="Symbol" w:hAnsi="Symbol" w:hint="default"/>
+        <w:color w:val="auto"/>
+      </w:rPr>
+    </w:lvl>
+    <w:lvl w:ilvl="1" w:tplc="04090003" w:tentative="1">
+      <w:start w:val="1"/>
+      <w:numFmt w:val="bullet"/>
+      <w:lvlText w:val="o"/>
+      <w:lvlJc w:val="left"/>
+      <w:pPr>
+        <w:ind w:left="1440" w:hanging="360"/>
+      </w:pPr>
+      <w:rPr>
+        <w:rFonts w:ascii="Courier New" w:hAnsi="Courier New" w:cs="Courier New" w:hint="default"/>
+      </w:rPr>
+    </w:lvl>
+    <w:lvl w:ilvl="2" w:tplc="04090005" w:tentative="1">
+      <w:start w:val="1"/>
+      <w:numFmt w:val="bullet"/>
+      <w:lvlText w:val=""/>
+      <w:lvlJc w:val="left"/>
+      <w:pPr>
+        <w:ind w:left="2160" w:hanging="360"/>
+      </w:pPr>
+      <w:rPr>
+        <w:rFonts w:ascii="Wingdings" w:hAnsi="Wingdings" w:hint="default"/>
+      </w:rPr>
+    </w:lvl>
+    <w:lvl w:ilvl="3" w:tplc="04090001" w:tentative="1">
+      <w:start w:val="1"/>
+      <w:numFmt w:val="bullet"/>
+      <w:lvlText w:val=""/>
+      <w:lvlJc w:val="left"/>
+      <w:pPr>
+        <w:ind w:left="2880" w:hanging="360"/>
+      </w:pPr>
+      <w:rPr>
+        <w:rFonts w:ascii="Symbol" w:hAnsi="Symbol" w:hint="default"/>
+      </w:rPr>
+    </w:lvl>
+    <w:lvl w:ilvl="4" w:tplc="04090003" w:tentative="1">
+      <w:start w:val="1"/>
+      <w:numFmt w:val="bullet"/>
+      <w:lvlText w:val="o"/>
+      <w:lvlJc w:val="left"/>
+      <w:pPr>
+        <w:ind w:left="3600" w:hanging="360"/>
+      </w:pPr>
+      <w:rPr>
+        <w:rFonts w:ascii="Courier New" w:hAnsi="Courier New" w:cs="Courier New" w:hint="default"/>
+      </w:rPr>
+    </w:lvl>
+    <w:lvl w:ilvl="5" w:tplc="04090005" w:tentative="1">
+      <w:start w:val="1"/>
+      <w:numFmt w:val="bullet"/>
+      <w:lvlText w:val=""/>
+      <w:lvlJc w:val="left"/>
+      <w:pPr>
+        <w:ind w:left="4320" w:hanging="360"/>
+      </w:pPr>
+      <w:rPr>
+        <w:rFonts w:ascii="Wingdings" w:hAnsi="Wingdings" w:hint="default"/>
+      </w:rPr>
+    </w:lvl>
+    <w:lvl w:ilvl="6" w:tplc="04090001" w:tentative="1">
+      <w:start w:val="1"/>
+      <w:numFmt w:val="bullet"/>
+      <w:lvlText w:val=""/>
+      <w:lvlJc w:val="left"/>
+      <w:pPr>
+        <w:ind w:left="5040" w:hanging="360"/>
+      </w:pPr>
+      <w:rPr>
+        <w:rFonts w:ascii="Symbol" w:hAnsi="Symbol" w:hint="default"/>
+      </w:rPr>
+    </w:lvl>
+    <w:lvl w:ilvl="7" w:tplc="04090003" w:tentative="1">
+      <w:start w:val="1"/>
+      <w:numFmt w:val="bullet"/>
+      <w:lvlText w:val="o"/>
+      <w:lvlJc w:val="left"/>
+      <w:pPr>
+        <w:ind w:left="5760" w:hanging="360"/>
+      </w:pPr>
+      <w:rPr>
+        <w:rFonts w:ascii="Courier New" w:hAnsi="Courier New" w:cs="Courier New" w:hint="default"/>
+      </w:rPr>
+    </w:lvl>
+    <w:lvl w:ilvl="8" w:tplc="04090005" w:tentative="1">
+      <w:start w:val="1"/>
+      <w:numFmt w:val="bullet"/>
+      <w:lvlText w:val=""/>
+      <w:lvlJc w:val="left"/>
+      <w:pPr>
+        <w:ind w:left="6480" w:hanging="360"/>
+      </w:pPr>
+      <w:rPr>
+        <w:rFonts w:ascii="Wingdings" w:hAnsi="Wingdings" w:hint="default"/>
+      </w:rPr>
+    </w:lvl>
+  </w:abstractNum>
+  <w:abstractNum w:abstractNumId="5">
+    <w:nsid w:val="5C492B27"/>
+    <w:multiLevelType w:val="hybridMultilevel"/>
+    <w:tmpl w:val="42924DE2"/>
+    <w:lvl w:ilvl="0" w:tplc="04090001">
+      <w:start w:val="1"/>
+      <w:numFmt w:val="bullet"/>
+      <w:lvlText w:val=""/>
+      <w:lvlJc w:val="left"/>
+      <w:pPr>
+        <w:ind w:left="360" w:hanging="360"/>
+      </w:pPr>
+      <w:rPr>
+        <w:rFonts w:ascii="Symbol" w:hAnsi="Symbol" w:hint="default"/>
+      </w:rPr>
+    </w:lvl>
+    <w:lvl w:ilvl="1" w:tplc="04090003" w:tentative="1">
+      <w:start w:val="1"/>
+      <w:numFmt w:val="bullet"/>
+      <w:lvlText w:val="o"/>
+      <w:lvlJc w:val="left"/>
+      <w:pPr>
+        <w:ind w:left="1080" w:hanging="360"/>
+      </w:pPr>
+      <w:rPr>
+        <w:rFonts w:ascii="Courier New" w:hAnsi="Courier New" w:cs="Courier New" w:hint="default"/>
+      </w:rPr>
+    </w:lvl>
+    <w:lvl w:ilvl="2" w:tplc="04090005" w:tentative="1">
+      <w:start w:val="1"/>
+      <w:numFmt w:val="bullet"/>
+      <w:lvlText w:val=""/>
+      <w:lvlJc w:val="left"/>
+      <w:pPr>
+        <w:ind w:left="1800" w:hanging="360"/>
+      </w:pPr>
+      <w:rPr>
+        <w:rFonts w:ascii="Wingdings" w:hAnsi="Wingdings" w:hint="default"/>
+      </w:rPr>
+    </w:lvl>
+    <w:lvl w:ilvl="3" w:tplc="04090001" w:tentative="1">
+      <w:start w:val="1"/>
+      <w:numFmt w:val="bullet"/>
+      <w:lvlText w:val=""/>
+      <w:lvlJc w:val="left"/>
+      <w:pPr>
+        <w:ind w:left="2520" w:hanging="360"/>
+      </w:pPr>
+      <w:rPr>
+        <w:rFonts w:ascii="Symbol" w:hAnsi="Symbol" w:hint="default"/>
+      </w:rPr>
+    </w:lvl>
+    <w:lvl w:ilvl="4" w:tplc="04090003" w:tentative="1">
+      <w:start w:val="1"/>
+      <w:numFmt w:val="bullet"/>
+      <w:lvlText w:val="o"/>
+      <w:lvlJc w:val="left"/>
+      <w:pPr>
+        <w:ind w:left="3240" w:hanging="360"/>
+      </w:pPr>
+      <w:rPr>
+        <w:rFonts w:ascii="Courier New" w:hAnsi="Courier New" w:cs="Courier New" w:hint="default"/>
+      </w:rPr>
+    </w:lvl>
+    <w:lvl w:ilvl="5" w:tplc="04090005" w:tentative="1">
+      <w:start w:val="1"/>
+      <w:numFmt w:val="bullet"/>
+      <w:lvlText w:val=""/>
+      <w:lvlJc w:val="left"/>
+      <w:pPr>
+        <w:ind w:left="3960" w:hanging="360"/>
+      </w:pPr>
+      <w:rPr>
+        <w:rFonts w:ascii="Wingdings" w:hAnsi="Wingdings" w:hint="default"/>
+      </w:rPr>
+    </w:lvl>
+    <w:lvl w:ilvl="6" w:tplc="04090001" w:tentative="1">
+      <w:start w:val="1"/>
+      <w:numFmt w:val="bullet"/>
+      <w:lvlText w:val=""/>
+      <w:lvlJc w:val="left"/>
+      <w:pPr>
+        <w:ind w:left="4680" w:hanging="360"/>
+      </w:pPr>
+      <w:rPr>
+        <w:rFonts w:ascii="Symbol" w:hAnsi="Symbol" w:hint="default"/>
+      </w:rPr>
+    </w:lvl>
+    <w:lvl w:ilvl="7" w:tplc="04090003" w:tentative="1">
+      <w:start w:val="1"/>
+      <w:numFmt w:val="bullet"/>
+      <w:lvlText w:val="o"/>
+      <w:lvlJc w:val="left"/>
+      <w:pPr>
+        <w:ind w:left="5400" w:hanging="360"/>
+      </w:pPr>
+      <w:rPr>
+        <w:rFonts w:ascii="Courier New" w:hAnsi="Courier New" w:cs="Courier New" w:hint="default"/>
+      </w:rPr>
+    </w:lvl>
+    <w:lvl w:ilvl="8" w:tplc="04090005" w:tentative="1">
+      <w:start w:val="1"/>
+      <w:numFmt w:val="bullet"/>
+      <w:lvlText w:val=""/>
+      <w:lvlJc w:val="left"/>
+      <w:pPr>
+        <w:ind w:left="6120" w:hanging="360"/>
+      </w:pPr>
+      <w:rPr>
+        <w:rFonts w:ascii="Wingdings" w:hAnsi="Wingdings" w:hint="default"/>
+      </w:rPr>
+    </w:lvl>
+  </w:abstractNum>
+  <w:abstractNum w:abstractNumId="6">
     <w:nsid w:val="64ED1D72"/>
     <w:multiLevelType w:val="hybridMultilevel"/>
     <w:tmpl w:val="C6DEC0C2"/>
@@ -745,6 +1813,119 @@
       <w:lvlJc w:val="left"/>
       <w:pPr>
         <w:ind w:left="6480" w:hanging="360"/>
+      </w:pPr>
+      <w:rPr>
+        <w:rFonts w:ascii="Wingdings" w:hAnsi="Wingdings" w:hint="default"/>
+      </w:rPr>
+    </w:lvl>
+  </w:abstractNum>
+  <w:abstractNum w:abstractNumId="7">
+    <w:nsid w:val="7BEE28EF"/>
+    <w:multiLevelType w:val="hybridMultilevel"/>
+    <w:tmpl w:val="40903AF6"/>
+    <w:lvl w:ilvl="0" w:tplc="04090001">
+      <w:start w:val="1"/>
+      <w:numFmt w:val="bullet"/>
+      <w:lvlText w:val=""/>
+      <w:lvlJc w:val="left"/>
+      <w:pPr>
+        <w:ind w:left="1440" w:hanging="360"/>
+      </w:pPr>
+      <w:rPr>
+        <w:rFonts w:ascii="Symbol" w:hAnsi="Symbol" w:hint="default"/>
+      </w:rPr>
+    </w:lvl>
+    <w:lvl w:ilvl="1" w:tplc="04090003" w:tentative="1">
+      <w:start w:val="1"/>
+      <w:numFmt w:val="bullet"/>
+      <w:lvlText w:val="o"/>
+      <w:lvlJc w:val="left"/>
+      <w:pPr>
+        <w:ind w:left="2160" w:hanging="360"/>
+      </w:pPr>
+      <w:rPr>
+        <w:rFonts w:ascii="Courier New" w:hAnsi="Courier New" w:cs="Courier New" w:hint="default"/>
+      </w:rPr>
+    </w:lvl>
+    <w:lvl w:ilvl="2" w:tplc="04090005" w:tentative="1">
+      <w:start w:val="1"/>
+      <w:numFmt w:val="bullet"/>
+      <w:lvlText w:val=""/>
+      <w:lvlJc w:val="left"/>
+      <w:pPr>
+        <w:ind w:left="2880" w:hanging="360"/>
+      </w:pPr>
+      <w:rPr>
+        <w:rFonts w:ascii="Wingdings" w:hAnsi="Wingdings" w:hint="default"/>
+      </w:rPr>
+    </w:lvl>
+    <w:lvl w:ilvl="3" w:tplc="04090001" w:tentative="1">
+      <w:start w:val="1"/>
+      <w:numFmt w:val="bullet"/>
+      <w:lvlText w:val=""/>
+      <w:lvlJc w:val="left"/>
+      <w:pPr>
+        <w:ind w:left="3600" w:hanging="360"/>
+      </w:pPr>
+      <w:rPr>
+        <w:rFonts w:ascii="Symbol" w:hAnsi="Symbol" w:hint="default"/>
+      </w:rPr>
+    </w:lvl>
+    <w:lvl w:ilvl="4" w:tplc="04090003" w:tentative="1">
+      <w:start w:val="1"/>
+      <w:numFmt w:val="bullet"/>
+      <w:lvlText w:val="o"/>
+      <w:lvlJc w:val="left"/>
+      <w:pPr>
+        <w:ind w:left="4320" w:hanging="360"/>
+      </w:pPr>
+      <w:rPr>
+        <w:rFonts w:ascii="Courier New" w:hAnsi="Courier New" w:cs="Courier New" w:hint="default"/>
+      </w:rPr>
+    </w:lvl>
+    <w:lvl w:ilvl="5" w:tplc="04090005" w:tentative="1">
+      <w:start w:val="1"/>
+      <w:numFmt w:val="bullet"/>
+      <w:lvlText w:val=""/>
+      <w:lvlJc w:val="left"/>
+      <w:pPr>
+        <w:ind w:left="5040" w:hanging="360"/>
+      </w:pPr>
+      <w:rPr>
+        <w:rFonts w:ascii="Wingdings" w:hAnsi="Wingdings" w:hint="default"/>
+      </w:rPr>
+    </w:lvl>
+    <w:lvl w:ilvl="6" w:tplc="04090001" w:tentative="1">
+      <w:start w:val="1"/>
+      <w:numFmt w:val="bullet"/>
+      <w:lvlText w:val=""/>
+      <w:lvlJc w:val="left"/>
+      <w:pPr>
+        <w:ind w:left="5760" w:hanging="360"/>
+      </w:pPr>
+      <w:rPr>
+        <w:rFonts w:ascii="Symbol" w:hAnsi="Symbol" w:hint="default"/>
+      </w:rPr>
+    </w:lvl>
+    <w:lvl w:ilvl="7" w:tplc="04090003" w:tentative="1">
+      <w:start w:val="1"/>
+      <w:numFmt w:val="bullet"/>
+      <w:lvlText w:val="o"/>
+      <w:lvlJc w:val="left"/>
+      <w:pPr>
+        <w:ind w:left="6480" w:hanging="360"/>
+      </w:pPr>
+      <w:rPr>
+        <w:rFonts w:ascii="Courier New" w:hAnsi="Courier New" w:cs="Courier New" w:hint="default"/>
+      </w:rPr>
+    </w:lvl>
+    <w:lvl w:ilvl="8" w:tplc="04090005" w:tentative="1">
+      <w:start w:val="1"/>
+      <w:numFmt w:val="bullet"/>
+      <w:lvlText w:val=""/>
+      <w:lvlJc w:val="left"/>
+      <w:pPr>
+        <w:ind w:left="7200" w:hanging="360"/>
       </w:pPr>
       <w:rPr>
         <w:rFonts w:ascii="Wingdings" w:hAnsi="Wingdings" w:hint="default"/>
@@ -755,6 +1936,24 @@
     <w:abstractNumId w:val="0"/>
   </w:num>
   <w:num w:numId="2">
+    <w:abstractNumId w:val="6"/>
+  </w:num>
+  <w:num w:numId="3">
+    <w:abstractNumId w:val="7"/>
+  </w:num>
+  <w:num w:numId="4">
+    <w:abstractNumId w:val="2"/>
+  </w:num>
+  <w:num w:numId="5">
+    <w:abstractNumId w:val="3"/>
+  </w:num>
+  <w:num w:numId="6">
+    <w:abstractNumId w:val="5"/>
+  </w:num>
+  <w:num w:numId="7">
+    <w:abstractNumId w:val="4"/>
+  </w:num>
+  <w:num w:numId="8">
     <w:abstractNumId w:val="1"/>
   </w:num>
 </w:numbering>
@@ -920,6 +2119,53 @@
     <w:name w:val="Normal"/>
     <w:qFormat/>
   </w:style>
+  <w:style w:type="paragraph" w:styleId="Heading1">
+    <w:name w:val="heading 1"/>
+    <w:basedOn w:val="Normal"/>
+    <w:next w:val="Normal"/>
+    <w:link w:val="Heading1Char"/>
+    <w:uiPriority w:val="9"/>
+    <w:qFormat/>
+    <w:rsid w:val="00CD6614"/>
+    <w:pPr>
+      <w:keepNext/>
+      <w:keepLines/>
+      <w:spacing w:before="480" w:after="0"/>
+      <w:outlineLvl w:val="0"/>
+    </w:pPr>
+    <w:rPr>
+      <w:rFonts w:asciiTheme="majorHAnsi" w:eastAsiaTheme="majorEastAsia" w:hAnsiTheme="majorHAnsi" w:cstheme="majorBidi"/>
+      <w:b/>
+      <w:bCs/>
+      <w:color w:val="365F91" w:themeColor="accent1" w:themeShade="BF"/>
+      <w:sz w:val="28"/>
+      <w:szCs w:val="28"/>
+    </w:rPr>
+  </w:style>
+  <w:style w:type="paragraph" w:styleId="Heading2">
+    <w:name w:val="heading 2"/>
+    <w:basedOn w:val="Normal"/>
+    <w:next w:val="Normal"/>
+    <w:link w:val="Heading2Char"/>
+    <w:uiPriority w:val="9"/>
+    <w:unhideWhenUsed/>
+    <w:qFormat/>
+    <w:rsid w:val="00CD6614"/>
+    <w:pPr>
+      <w:keepNext/>
+      <w:keepLines/>
+      <w:spacing w:before="200" w:after="0"/>
+      <w:outlineLvl w:val="1"/>
+    </w:pPr>
+    <w:rPr>
+      <w:rFonts w:asciiTheme="majorHAnsi" w:eastAsiaTheme="majorEastAsia" w:hAnsiTheme="majorHAnsi" w:cstheme="majorBidi"/>
+      <w:b/>
+      <w:bCs/>
+      <w:color w:val="4F81BD" w:themeColor="accent1"/>
+      <w:sz w:val="26"/>
+      <w:szCs w:val="26"/>
+    </w:rPr>
+  </w:style>
   <w:style w:type="character" w:default="1" w:styleId="DefaultParagraphFont">
     <w:name w:val="Default Paragraph Font"/>
     <w:uiPriority w:val="1"/>
@@ -957,6 +2203,158 @@
       <w:ind w:left="720"/>
       <w:contextualSpacing/>
     </w:pPr>
+  </w:style>
+  <w:style w:type="paragraph" w:styleId="Title">
+    <w:name w:val="Title"/>
+    <w:basedOn w:val="Normal"/>
+    <w:next w:val="Normal"/>
+    <w:link w:val="TitleChar"/>
+    <w:uiPriority w:val="10"/>
+    <w:qFormat/>
+    <w:rsid w:val="00CD6614"/>
+    <w:pPr>
+      <w:pBdr>
+        <w:bottom w:val="single" w:sz="8" w:space="4" w:color="4F81BD" w:themeColor="accent1"/>
+      </w:pBdr>
+      <w:spacing w:after="300" w:line="240" w:lineRule="auto"/>
+      <w:contextualSpacing/>
+    </w:pPr>
+    <w:rPr>
+      <w:rFonts w:asciiTheme="majorHAnsi" w:eastAsiaTheme="majorEastAsia" w:hAnsiTheme="majorHAnsi" w:cstheme="majorBidi"/>
+      <w:color w:val="17365D" w:themeColor="text2" w:themeShade="BF"/>
+      <w:spacing w:val="5"/>
+      <w:kern w:val="28"/>
+      <w:sz w:val="52"/>
+      <w:szCs w:val="52"/>
+    </w:rPr>
+  </w:style>
+  <w:style w:type="character" w:customStyle="1" w:styleId="TitleChar">
+    <w:name w:val="Title Char"/>
+    <w:basedOn w:val="DefaultParagraphFont"/>
+    <w:link w:val="Title"/>
+    <w:uiPriority w:val="10"/>
+    <w:rsid w:val="00CD6614"/>
+    <w:rPr>
+      <w:rFonts w:asciiTheme="majorHAnsi" w:eastAsiaTheme="majorEastAsia" w:hAnsiTheme="majorHAnsi" w:cstheme="majorBidi"/>
+      <w:color w:val="17365D" w:themeColor="text2" w:themeShade="BF"/>
+      <w:spacing w:val="5"/>
+      <w:kern w:val="28"/>
+      <w:sz w:val="52"/>
+      <w:szCs w:val="52"/>
+    </w:rPr>
+  </w:style>
+  <w:style w:type="character" w:styleId="IntenseEmphasis">
+    <w:name w:val="Intense Emphasis"/>
+    <w:basedOn w:val="DefaultParagraphFont"/>
+    <w:uiPriority w:val="21"/>
+    <w:qFormat/>
+    <w:rsid w:val="00CD6614"/>
+    <w:rPr>
+      <w:b/>
+      <w:bCs/>
+      <w:i/>
+      <w:iCs/>
+      <w:color w:val="4F81BD" w:themeColor="accent1"/>
+    </w:rPr>
+  </w:style>
+  <w:style w:type="paragraph" w:styleId="Subtitle">
+    <w:name w:val="Subtitle"/>
+    <w:basedOn w:val="Normal"/>
+    <w:next w:val="Normal"/>
+    <w:link w:val="SubtitleChar"/>
+    <w:uiPriority w:val="11"/>
+    <w:qFormat/>
+    <w:rsid w:val="00CD6614"/>
+    <w:pPr>
+      <w:numPr>
+        <w:ilvl w:val="1"/>
+      </w:numPr>
+    </w:pPr>
+    <w:rPr>
+      <w:rFonts w:asciiTheme="majorHAnsi" w:eastAsiaTheme="majorEastAsia" w:hAnsiTheme="majorHAnsi" w:cstheme="majorBidi"/>
+      <w:i/>
+      <w:iCs/>
+      <w:color w:val="4F81BD" w:themeColor="accent1"/>
+      <w:spacing w:val="15"/>
+      <w:sz w:val="24"/>
+      <w:szCs w:val="24"/>
+    </w:rPr>
+  </w:style>
+  <w:style w:type="character" w:customStyle="1" w:styleId="SubtitleChar">
+    <w:name w:val="Subtitle Char"/>
+    <w:basedOn w:val="DefaultParagraphFont"/>
+    <w:link w:val="Subtitle"/>
+    <w:uiPriority w:val="11"/>
+    <w:rsid w:val="00CD6614"/>
+    <w:rPr>
+      <w:rFonts w:asciiTheme="majorHAnsi" w:eastAsiaTheme="majorEastAsia" w:hAnsiTheme="majorHAnsi" w:cstheme="majorBidi"/>
+      <w:i/>
+      <w:iCs/>
+      <w:color w:val="4F81BD" w:themeColor="accent1"/>
+      <w:spacing w:val="15"/>
+      <w:sz w:val="24"/>
+      <w:szCs w:val="24"/>
+    </w:rPr>
+  </w:style>
+  <w:style w:type="paragraph" w:styleId="BalloonText">
+    <w:name w:val="Balloon Text"/>
+    <w:basedOn w:val="Normal"/>
+    <w:link w:val="BalloonTextChar"/>
+    <w:uiPriority w:val="99"/>
+    <w:semiHidden/>
+    <w:unhideWhenUsed/>
+    <w:rsid w:val="00CD6614"/>
+    <w:pPr>
+      <w:spacing w:after="0" w:line="240" w:lineRule="auto"/>
+    </w:pPr>
+    <w:rPr>
+      <w:rFonts w:ascii="Tahoma" w:hAnsi="Tahoma" w:cs="Tahoma"/>
+      <w:sz w:val="16"/>
+      <w:szCs w:val="16"/>
+    </w:rPr>
+  </w:style>
+  <w:style w:type="character" w:customStyle="1" w:styleId="BalloonTextChar">
+    <w:name w:val="Balloon Text Char"/>
+    <w:basedOn w:val="DefaultParagraphFont"/>
+    <w:link w:val="BalloonText"/>
+    <w:uiPriority w:val="99"/>
+    <w:semiHidden/>
+    <w:rsid w:val="00CD6614"/>
+    <w:rPr>
+      <w:rFonts w:ascii="Tahoma" w:hAnsi="Tahoma" w:cs="Tahoma"/>
+      <w:sz w:val="16"/>
+      <w:szCs w:val="16"/>
+    </w:rPr>
+  </w:style>
+  <w:style w:type="character" w:customStyle="1" w:styleId="Heading1Char">
+    <w:name w:val="Heading 1 Char"/>
+    <w:basedOn w:val="DefaultParagraphFont"/>
+    <w:link w:val="Heading1"/>
+    <w:uiPriority w:val="9"/>
+    <w:rsid w:val="00CD6614"/>
+    <w:rPr>
+      <w:rFonts w:asciiTheme="majorHAnsi" w:eastAsiaTheme="majorEastAsia" w:hAnsiTheme="majorHAnsi" w:cstheme="majorBidi"/>
+      <w:b/>
+      <w:bCs/>
+      <w:color w:val="365F91" w:themeColor="accent1" w:themeShade="BF"/>
+      <w:sz w:val="28"/>
+      <w:szCs w:val="28"/>
+    </w:rPr>
+  </w:style>
+  <w:style w:type="character" w:customStyle="1" w:styleId="Heading2Char">
+    <w:name w:val="Heading 2 Char"/>
+    <w:basedOn w:val="DefaultParagraphFont"/>
+    <w:link w:val="Heading2"/>
+    <w:uiPriority w:val="9"/>
+    <w:rsid w:val="00CD6614"/>
+    <w:rPr>
+      <w:rFonts w:asciiTheme="majorHAnsi" w:eastAsiaTheme="majorEastAsia" w:hAnsiTheme="majorHAnsi" w:cstheme="majorBidi"/>
+      <w:b/>
+      <w:bCs/>
+      <w:color w:val="4F81BD" w:themeColor="accent1"/>
+      <w:sz w:val="26"/>
+      <w:szCs w:val="26"/>
+    </w:rPr>
   </w:style>
 </w:styles>
 </file>
@@ -1121,6 +2519,53 @@
     <w:name w:val="Normal"/>
     <w:qFormat/>
   </w:style>
+  <w:style w:type="paragraph" w:styleId="Heading1">
+    <w:name w:val="heading 1"/>
+    <w:basedOn w:val="Normal"/>
+    <w:next w:val="Normal"/>
+    <w:link w:val="Heading1Char"/>
+    <w:uiPriority w:val="9"/>
+    <w:qFormat/>
+    <w:rsid w:val="00CD6614"/>
+    <w:pPr>
+      <w:keepNext/>
+      <w:keepLines/>
+      <w:spacing w:before="480" w:after="0"/>
+      <w:outlineLvl w:val="0"/>
+    </w:pPr>
+    <w:rPr>
+      <w:rFonts w:asciiTheme="majorHAnsi" w:eastAsiaTheme="majorEastAsia" w:hAnsiTheme="majorHAnsi" w:cstheme="majorBidi"/>
+      <w:b/>
+      <w:bCs/>
+      <w:color w:val="365F91" w:themeColor="accent1" w:themeShade="BF"/>
+      <w:sz w:val="28"/>
+      <w:szCs w:val="28"/>
+    </w:rPr>
+  </w:style>
+  <w:style w:type="paragraph" w:styleId="Heading2">
+    <w:name w:val="heading 2"/>
+    <w:basedOn w:val="Normal"/>
+    <w:next w:val="Normal"/>
+    <w:link w:val="Heading2Char"/>
+    <w:uiPriority w:val="9"/>
+    <w:unhideWhenUsed/>
+    <w:qFormat/>
+    <w:rsid w:val="00CD6614"/>
+    <w:pPr>
+      <w:keepNext/>
+      <w:keepLines/>
+      <w:spacing w:before="200" w:after="0"/>
+      <w:outlineLvl w:val="1"/>
+    </w:pPr>
+    <w:rPr>
+      <w:rFonts w:asciiTheme="majorHAnsi" w:eastAsiaTheme="majorEastAsia" w:hAnsiTheme="majorHAnsi" w:cstheme="majorBidi"/>
+      <w:b/>
+      <w:bCs/>
+      <w:color w:val="4F81BD" w:themeColor="accent1"/>
+      <w:sz w:val="26"/>
+      <w:szCs w:val="26"/>
+    </w:rPr>
+  </w:style>
   <w:style w:type="character" w:default="1" w:styleId="DefaultParagraphFont">
     <w:name w:val="Default Paragraph Font"/>
     <w:uiPriority w:val="1"/>
@@ -1158,6 +2603,158 @@
       <w:ind w:left="720"/>
       <w:contextualSpacing/>
     </w:pPr>
+  </w:style>
+  <w:style w:type="paragraph" w:styleId="Title">
+    <w:name w:val="Title"/>
+    <w:basedOn w:val="Normal"/>
+    <w:next w:val="Normal"/>
+    <w:link w:val="TitleChar"/>
+    <w:uiPriority w:val="10"/>
+    <w:qFormat/>
+    <w:rsid w:val="00CD6614"/>
+    <w:pPr>
+      <w:pBdr>
+        <w:bottom w:val="single" w:sz="8" w:space="4" w:color="4F81BD" w:themeColor="accent1"/>
+      </w:pBdr>
+      <w:spacing w:after="300" w:line="240" w:lineRule="auto"/>
+      <w:contextualSpacing/>
+    </w:pPr>
+    <w:rPr>
+      <w:rFonts w:asciiTheme="majorHAnsi" w:eastAsiaTheme="majorEastAsia" w:hAnsiTheme="majorHAnsi" w:cstheme="majorBidi"/>
+      <w:color w:val="17365D" w:themeColor="text2" w:themeShade="BF"/>
+      <w:spacing w:val="5"/>
+      <w:kern w:val="28"/>
+      <w:sz w:val="52"/>
+      <w:szCs w:val="52"/>
+    </w:rPr>
+  </w:style>
+  <w:style w:type="character" w:customStyle="1" w:styleId="TitleChar">
+    <w:name w:val="Title Char"/>
+    <w:basedOn w:val="DefaultParagraphFont"/>
+    <w:link w:val="Title"/>
+    <w:uiPriority w:val="10"/>
+    <w:rsid w:val="00CD6614"/>
+    <w:rPr>
+      <w:rFonts w:asciiTheme="majorHAnsi" w:eastAsiaTheme="majorEastAsia" w:hAnsiTheme="majorHAnsi" w:cstheme="majorBidi"/>
+      <w:color w:val="17365D" w:themeColor="text2" w:themeShade="BF"/>
+      <w:spacing w:val="5"/>
+      <w:kern w:val="28"/>
+      <w:sz w:val="52"/>
+      <w:szCs w:val="52"/>
+    </w:rPr>
+  </w:style>
+  <w:style w:type="character" w:styleId="IntenseEmphasis">
+    <w:name w:val="Intense Emphasis"/>
+    <w:basedOn w:val="DefaultParagraphFont"/>
+    <w:uiPriority w:val="21"/>
+    <w:qFormat/>
+    <w:rsid w:val="00CD6614"/>
+    <w:rPr>
+      <w:b/>
+      <w:bCs/>
+      <w:i/>
+      <w:iCs/>
+      <w:color w:val="4F81BD" w:themeColor="accent1"/>
+    </w:rPr>
+  </w:style>
+  <w:style w:type="paragraph" w:styleId="Subtitle">
+    <w:name w:val="Subtitle"/>
+    <w:basedOn w:val="Normal"/>
+    <w:next w:val="Normal"/>
+    <w:link w:val="SubtitleChar"/>
+    <w:uiPriority w:val="11"/>
+    <w:qFormat/>
+    <w:rsid w:val="00CD6614"/>
+    <w:pPr>
+      <w:numPr>
+        <w:ilvl w:val="1"/>
+      </w:numPr>
+    </w:pPr>
+    <w:rPr>
+      <w:rFonts w:asciiTheme="majorHAnsi" w:eastAsiaTheme="majorEastAsia" w:hAnsiTheme="majorHAnsi" w:cstheme="majorBidi"/>
+      <w:i/>
+      <w:iCs/>
+      <w:color w:val="4F81BD" w:themeColor="accent1"/>
+      <w:spacing w:val="15"/>
+      <w:sz w:val="24"/>
+      <w:szCs w:val="24"/>
+    </w:rPr>
+  </w:style>
+  <w:style w:type="character" w:customStyle="1" w:styleId="SubtitleChar">
+    <w:name w:val="Subtitle Char"/>
+    <w:basedOn w:val="DefaultParagraphFont"/>
+    <w:link w:val="Subtitle"/>
+    <w:uiPriority w:val="11"/>
+    <w:rsid w:val="00CD6614"/>
+    <w:rPr>
+      <w:rFonts w:asciiTheme="majorHAnsi" w:eastAsiaTheme="majorEastAsia" w:hAnsiTheme="majorHAnsi" w:cstheme="majorBidi"/>
+      <w:i/>
+      <w:iCs/>
+      <w:color w:val="4F81BD" w:themeColor="accent1"/>
+      <w:spacing w:val="15"/>
+      <w:sz w:val="24"/>
+      <w:szCs w:val="24"/>
+    </w:rPr>
+  </w:style>
+  <w:style w:type="paragraph" w:styleId="BalloonText">
+    <w:name w:val="Balloon Text"/>
+    <w:basedOn w:val="Normal"/>
+    <w:link w:val="BalloonTextChar"/>
+    <w:uiPriority w:val="99"/>
+    <w:semiHidden/>
+    <w:unhideWhenUsed/>
+    <w:rsid w:val="00CD6614"/>
+    <w:pPr>
+      <w:spacing w:after="0" w:line="240" w:lineRule="auto"/>
+    </w:pPr>
+    <w:rPr>
+      <w:rFonts w:ascii="Tahoma" w:hAnsi="Tahoma" w:cs="Tahoma"/>
+      <w:sz w:val="16"/>
+      <w:szCs w:val="16"/>
+    </w:rPr>
+  </w:style>
+  <w:style w:type="character" w:customStyle="1" w:styleId="BalloonTextChar">
+    <w:name w:val="Balloon Text Char"/>
+    <w:basedOn w:val="DefaultParagraphFont"/>
+    <w:link w:val="BalloonText"/>
+    <w:uiPriority w:val="99"/>
+    <w:semiHidden/>
+    <w:rsid w:val="00CD6614"/>
+    <w:rPr>
+      <w:rFonts w:ascii="Tahoma" w:hAnsi="Tahoma" w:cs="Tahoma"/>
+      <w:sz w:val="16"/>
+      <w:szCs w:val="16"/>
+    </w:rPr>
+  </w:style>
+  <w:style w:type="character" w:customStyle="1" w:styleId="Heading1Char">
+    <w:name w:val="Heading 1 Char"/>
+    <w:basedOn w:val="DefaultParagraphFont"/>
+    <w:link w:val="Heading1"/>
+    <w:uiPriority w:val="9"/>
+    <w:rsid w:val="00CD6614"/>
+    <w:rPr>
+      <w:rFonts w:asciiTheme="majorHAnsi" w:eastAsiaTheme="majorEastAsia" w:hAnsiTheme="majorHAnsi" w:cstheme="majorBidi"/>
+      <w:b/>
+      <w:bCs/>
+      <w:color w:val="365F91" w:themeColor="accent1" w:themeShade="BF"/>
+      <w:sz w:val="28"/>
+      <w:szCs w:val="28"/>
+    </w:rPr>
+  </w:style>
+  <w:style w:type="character" w:customStyle="1" w:styleId="Heading2Char">
+    <w:name w:val="Heading 2 Char"/>
+    <w:basedOn w:val="DefaultParagraphFont"/>
+    <w:link w:val="Heading2"/>
+    <w:uiPriority w:val="9"/>
+    <w:rsid w:val="00CD6614"/>
+    <w:rPr>
+      <w:rFonts w:asciiTheme="majorHAnsi" w:eastAsiaTheme="majorEastAsia" w:hAnsiTheme="majorHAnsi" w:cstheme="majorBidi"/>
+      <w:b/>
+      <w:bCs/>
+      <w:color w:val="4F81BD" w:themeColor="accent1"/>
+      <w:sz w:val="26"/>
+      <w:szCs w:val="26"/>
+    </w:rPr>
   </w:style>
 </w:styles>
 </file>

</xml_diff>